<commit_message>
Confidence thresholds, videos and map documentation (#10)
* finetuning first steps

* finetuning first steps

* joe

* joe

* joe

* joe

* joe

* joe

* joe

* joe

* joe

* joe

* joe

* joe

* joe

* joe

* joe

* joe

* joe

* joe

* joe

* joe

* joe

* joe

* no word shenanigans

* data augmentation

* joe

* checkpoint

* added tinyimagenet

* quick changes

* joe

* loss function implementation

* joe

* joe

* joe

* joe

* joe

* joe

* joe

* joe

* status update

* status update

* debug

* debug

* status update before merge

* update map documentation and added confidence threshold finder

* confusion matrix and mAP printing

* video processing

* experiment results

* video processing

* joe

* joe

* joe
</commit_message>
<xml_diff>
--- a/assignment_4/infomcv_assignment_4_report.docx
+++ b/assignment_4/infomcv_assignment_4_report.docx
@@ -4,7 +4,7 @@
   <w:body>
     <w:p>
       <w:pPr>
-        <w:pStyle w:val="NoSpacing"/>
+        <w:pStyle w:val="Geenafstand"/>
         <w:jc w:val="center"/>
         <w:rPr>
           <w:b/>
@@ -28,7 +28,7 @@
     </w:p>
     <w:p>
       <w:pPr>
-        <w:pStyle w:val="NoSpacing"/>
+        <w:pStyle w:val="Geenafstand"/>
         <w:jc w:val="center"/>
         <w:rPr>
           <w:b/>
@@ -66,7 +66,7 @@
     </w:p>
     <w:p>
       <w:pPr>
-        <w:pStyle w:val="NoSpacing"/>
+        <w:pStyle w:val="Geenafstand"/>
         <w:rPr>
           <w:b/>
           <w:sz w:val="28"/>
@@ -75,12 +75,12 @@
     </w:p>
     <w:p>
       <w:pPr>
-        <w:pStyle w:val="NoSpacing"/>
-      </w:pPr>
-    </w:p>
-    <w:p>
-      <w:pPr>
-        <w:pStyle w:val="NoSpacing"/>
+        <w:pStyle w:val="Geenafstand"/>
+      </w:pPr>
+    </w:p>
+    <w:p>
+      <w:pPr>
+        <w:pStyle w:val="Geenafstand"/>
         <w:rPr>
           <w:b/>
           <w:sz w:val="24"/>
@@ -106,7 +106,7 @@
     </w:p>
     <w:p>
       <w:pPr>
-        <w:pStyle w:val="NoSpacing"/>
+        <w:pStyle w:val="Geenafstand"/>
         <w:rPr>
           <w:lang w:val="en-GB"/>
         </w:rPr>
@@ -149,7 +149,7 @@
     </w:p>
     <w:p>
       <w:pPr>
-        <w:pStyle w:val="NoSpacing"/>
+        <w:pStyle w:val="Geenafstand"/>
         <w:rPr>
           <w:lang w:val="en-GB"/>
         </w:rPr>
@@ -225,80 +225,57 @@
     </w:p>
     <w:p>
       <w:pPr>
-        <w:pStyle w:val="NoSpacing"/>
-        <w:rPr>
-          <w:rStyle w:val="SubtleEmphasis"/>
-          <w:sz w:val="18"/>
-          <w:szCs w:val="18"/>
-          <w:lang w:val="en-GB"/>
-        </w:rPr>
-      </w:pPr>
-      <w:commentRangeStart w:id="0"/>
-      <w:r>
-        <w:rPr>
-          <w:rStyle w:val="SubtleEmphasis"/>
-          <w:sz w:val="18"/>
-          <w:szCs w:val="18"/>
-          <w:lang w:val="en-GB"/>
-        </w:rPr>
-        <w:t>YOLOv1Base</w:t>
-      </w:r>
-      <w:commentRangeEnd w:id="0"/>
-      <w:r>
-        <w:rPr>
-          <w:rStyle w:val="CommentReference"/>
-          <w:i/>
-          <w:iCs/>
-          <w:color w:val="404040" w:themeColor="text1" w:themeTint="BF"/>
-          <w:sz w:val="18"/>
-          <w:szCs w:val="18"/>
-          <w:lang w:val="en-GB"/>
-        </w:rPr>
-        <w:commentReference w:id="0"/>
-      </w:r>
-      <w:r>
-        <w:rPr>
-          <w:rStyle w:val="SubtleEmphasis"/>
-          <w:sz w:val="18"/>
-          <w:szCs w:val="18"/>
-          <w:lang w:val="en-GB"/>
-        </w:rPr>
-        <w:t>(</w:t>
-      </w:r>
-    </w:p>
-    <w:p>
-      <w:pPr>
-        <w:pStyle w:val="NoSpacing"/>
-        <w:rPr>
-          <w:rStyle w:val="SubtleEmphasis"/>
-          <w:sz w:val="18"/>
-          <w:szCs w:val="18"/>
-          <w:lang w:val="en-GB"/>
-        </w:rPr>
-      </w:pPr>
-      <w:r>
-        <w:rPr>
-          <w:rStyle w:val="SubtleEmphasis"/>
-          <w:sz w:val="18"/>
-          <w:szCs w:val="18"/>
-          <w:lang w:val="en-GB"/>
-        </w:rPr>
-        <w:t xml:space="preserve">  (layers): Sequential(</w:t>
-      </w:r>
-    </w:p>
-    <w:p>
-      <w:pPr>
-        <w:pStyle w:val="NoSpacing"/>
-        <w:rPr>
-          <w:rStyle w:val="SubtleEmphasis"/>
-          <w:sz w:val="18"/>
-          <w:szCs w:val="18"/>
-          <w:lang w:val="en-GB"/>
-        </w:rPr>
-      </w:pPr>
-      <w:r>
-        <w:rPr>
-          <w:rStyle w:val="SubtleEmphasis"/>
+        <w:pStyle w:val="Geenafstand"/>
+        <w:rPr>
+          <w:rStyle w:val="Subtielebenadrukking"/>
+          <w:sz w:val="18"/>
+          <w:szCs w:val="18"/>
+          <w:lang w:val="en-GB"/>
+        </w:rPr>
+      </w:pPr>
+      <w:r>
+        <w:rPr>
+          <w:rStyle w:val="Subtielebenadrukking"/>
+          <w:sz w:val="18"/>
+          <w:szCs w:val="18"/>
+          <w:lang w:val="en-GB"/>
+        </w:rPr>
+        <w:t>YOLOv1Base(</w:t>
+      </w:r>
+    </w:p>
+    <w:p>
+      <w:pPr>
+        <w:pStyle w:val="Geenafstand"/>
+        <w:rPr>
+          <w:rStyle w:val="Subtielebenadrukking"/>
+          <w:sz w:val="18"/>
+          <w:szCs w:val="18"/>
+          <w:lang w:val="en-GB"/>
+        </w:rPr>
+      </w:pPr>
+      <w:r>
+        <w:rPr>
+          <w:rStyle w:val="Subtielebenadrukking"/>
+          <w:sz w:val="18"/>
+          <w:szCs w:val="18"/>
+          <w:lang w:val="en-GB"/>
+        </w:rPr>
+        <w:t xml:space="preserve">  (backbone): Sequential(</w:t>
+      </w:r>
+    </w:p>
+    <w:p>
+      <w:pPr>
+        <w:pStyle w:val="Geenafstand"/>
+        <w:rPr>
+          <w:rStyle w:val="Subtielebenadrukking"/>
+          <w:sz w:val="18"/>
+          <w:szCs w:val="18"/>
+          <w:lang w:val="en-GB"/>
+        </w:rPr>
+      </w:pPr>
+      <w:r>
+        <w:rPr>
+          <w:rStyle w:val="Subtielebenadrukking"/>
           <w:sz w:val="18"/>
           <w:szCs w:val="18"/>
           <w:lang w:val="en-GB"/>
@@ -308,17 +285,17 @@
     </w:p>
     <w:p>
       <w:pPr>
-        <w:pStyle w:val="NoSpacing"/>
-        <w:rPr>
-          <w:rStyle w:val="SubtleEmphasis"/>
-          <w:sz w:val="18"/>
-          <w:szCs w:val="18"/>
-          <w:lang w:val="en-GB"/>
-        </w:rPr>
-      </w:pPr>
-      <w:r>
-        <w:rPr>
-          <w:rStyle w:val="SubtleEmphasis"/>
+        <w:pStyle w:val="Geenafstand"/>
+        <w:rPr>
+          <w:rStyle w:val="Subtielebenadrukking"/>
+          <w:sz w:val="18"/>
+          <w:szCs w:val="18"/>
+          <w:lang w:val="en-GB"/>
+        </w:rPr>
+      </w:pPr>
+      <w:r>
+        <w:rPr>
+          <w:rStyle w:val="Subtielebenadrukking"/>
           <w:sz w:val="18"/>
           <w:szCs w:val="18"/>
           <w:lang w:val="en-GB"/>
@@ -328,37 +305,37 @@
     </w:p>
     <w:p>
       <w:pPr>
-        <w:pStyle w:val="NoSpacing"/>
-        <w:rPr>
-          <w:rStyle w:val="SubtleEmphasis"/>
-          <w:sz w:val="18"/>
-          <w:szCs w:val="18"/>
-          <w:lang w:val="en-GB"/>
-        </w:rPr>
-      </w:pPr>
-      <w:r>
-        <w:rPr>
-          <w:rStyle w:val="SubtleEmphasis"/>
-          <w:sz w:val="18"/>
-          <w:szCs w:val="18"/>
-          <w:lang w:val="en-GB"/>
-        </w:rPr>
-        <w:t xml:space="preserve">    (2): ReLU()</w:t>
-      </w:r>
-    </w:p>
-    <w:p>
-      <w:pPr>
-        <w:pStyle w:val="NoSpacing"/>
-        <w:rPr>
-          <w:rStyle w:val="SubtleEmphasis"/>
-          <w:sz w:val="18"/>
-          <w:szCs w:val="18"/>
-          <w:lang w:val="en-GB"/>
-        </w:rPr>
-      </w:pPr>
-      <w:r>
-        <w:rPr>
-          <w:rStyle w:val="SubtleEmphasis"/>
+        <w:pStyle w:val="Geenafstand"/>
+        <w:rPr>
+          <w:rStyle w:val="Subtielebenadrukking"/>
+          <w:sz w:val="18"/>
+          <w:szCs w:val="18"/>
+          <w:lang w:val="en-GB"/>
+        </w:rPr>
+      </w:pPr>
+      <w:r>
+        <w:rPr>
+          <w:rStyle w:val="Subtielebenadrukking"/>
+          <w:sz w:val="18"/>
+          <w:szCs w:val="18"/>
+          <w:lang w:val="en-GB"/>
+        </w:rPr>
+        <w:t xml:space="preserve">    (2): LeakyReLU(negative_slope=0.1)</w:t>
+      </w:r>
+    </w:p>
+    <w:p>
+      <w:pPr>
+        <w:pStyle w:val="Geenafstand"/>
+        <w:rPr>
+          <w:rStyle w:val="Subtielebenadrukking"/>
+          <w:sz w:val="18"/>
+          <w:szCs w:val="18"/>
+          <w:lang w:val="en-GB"/>
+        </w:rPr>
+      </w:pPr>
+      <w:r>
+        <w:rPr>
+          <w:rStyle w:val="Subtielebenadrukking"/>
           <w:sz w:val="18"/>
           <w:szCs w:val="18"/>
           <w:lang w:val="en-GB"/>
@@ -368,17 +345,17 @@
     </w:p>
     <w:p>
       <w:pPr>
-        <w:pStyle w:val="NoSpacing"/>
-        <w:rPr>
-          <w:rStyle w:val="SubtleEmphasis"/>
-          <w:sz w:val="18"/>
-          <w:szCs w:val="18"/>
-          <w:lang w:val="en-GB"/>
-        </w:rPr>
-      </w:pPr>
-      <w:r>
-        <w:rPr>
-          <w:rStyle w:val="SubtleEmphasis"/>
+        <w:pStyle w:val="Geenafstand"/>
+        <w:rPr>
+          <w:rStyle w:val="Subtielebenadrukking"/>
+          <w:sz w:val="18"/>
+          <w:szCs w:val="18"/>
+          <w:lang w:val="en-GB"/>
+        </w:rPr>
+      </w:pPr>
+      <w:r>
+        <w:rPr>
+          <w:rStyle w:val="Subtielebenadrukking"/>
           <w:sz w:val="18"/>
           <w:szCs w:val="18"/>
           <w:lang w:val="en-GB"/>
@@ -388,17 +365,17 @@
     </w:p>
     <w:p>
       <w:pPr>
-        <w:pStyle w:val="NoSpacing"/>
-        <w:rPr>
-          <w:rStyle w:val="SubtleEmphasis"/>
-          <w:sz w:val="18"/>
-          <w:szCs w:val="18"/>
-          <w:lang w:val="en-GB"/>
-        </w:rPr>
-      </w:pPr>
-      <w:r>
-        <w:rPr>
-          <w:rStyle w:val="SubtleEmphasis"/>
+        <w:pStyle w:val="Geenafstand"/>
+        <w:rPr>
+          <w:rStyle w:val="Subtielebenadrukking"/>
+          <w:sz w:val="18"/>
+          <w:szCs w:val="18"/>
+          <w:lang w:val="en-GB"/>
+        </w:rPr>
+      </w:pPr>
+      <w:r>
+        <w:rPr>
+          <w:rStyle w:val="Subtielebenadrukking"/>
           <w:sz w:val="18"/>
           <w:szCs w:val="18"/>
           <w:lang w:val="en-GB"/>
@@ -408,37 +385,37 @@
     </w:p>
     <w:p>
       <w:pPr>
-        <w:pStyle w:val="NoSpacing"/>
-        <w:rPr>
-          <w:rStyle w:val="SubtleEmphasis"/>
-          <w:sz w:val="18"/>
-          <w:szCs w:val="18"/>
-          <w:lang w:val="en-GB"/>
-        </w:rPr>
-      </w:pPr>
-      <w:r>
-        <w:rPr>
-          <w:rStyle w:val="SubtleEmphasis"/>
-          <w:sz w:val="18"/>
-          <w:szCs w:val="18"/>
-          <w:lang w:val="en-GB"/>
-        </w:rPr>
-        <w:t xml:space="preserve">    (6): ReLU()</w:t>
-      </w:r>
-    </w:p>
-    <w:p>
-      <w:pPr>
-        <w:pStyle w:val="NoSpacing"/>
-        <w:rPr>
-          <w:rStyle w:val="SubtleEmphasis"/>
-          <w:sz w:val="18"/>
-          <w:szCs w:val="18"/>
-          <w:lang w:val="en-GB"/>
-        </w:rPr>
-      </w:pPr>
-      <w:r>
-        <w:rPr>
-          <w:rStyle w:val="SubtleEmphasis"/>
+        <w:pStyle w:val="Geenafstand"/>
+        <w:rPr>
+          <w:rStyle w:val="Subtielebenadrukking"/>
+          <w:sz w:val="18"/>
+          <w:szCs w:val="18"/>
+          <w:lang w:val="en-GB"/>
+        </w:rPr>
+      </w:pPr>
+      <w:r>
+        <w:rPr>
+          <w:rStyle w:val="Subtielebenadrukking"/>
+          <w:sz w:val="18"/>
+          <w:szCs w:val="18"/>
+          <w:lang w:val="en-GB"/>
+        </w:rPr>
+        <w:t xml:space="preserve">    (6): LeakyReLU(negative_slope=0.1)</w:t>
+      </w:r>
+    </w:p>
+    <w:p>
+      <w:pPr>
+        <w:pStyle w:val="Geenafstand"/>
+        <w:rPr>
+          <w:rStyle w:val="Subtielebenadrukking"/>
+          <w:sz w:val="18"/>
+          <w:szCs w:val="18"/>
+          <w:lang w:val="en-GB"/>
+        </w:rPr>
+      </w:pPr>
+      <w:r>
+        <w:rPr>
+          <w:rStyle w:val="Subtielebenadrukking"/>
           <w:sz w:val="18"/>
           <w:szCs w:val="18"/>
           <w:lang w:val="en-GB"/>
@@ -448,17 +425,17 @@
     </w:p>
     <w:p>
       <w:pPr>
-        <w:pStyle w:val="NoSpacing"/>
-        <w:rPr>
-          <w:rStyle w:val="SubtleEmphasis"/>
-          <w:sz w:val="18"/>
-          <w:szCs w:val="18"/>
-          <w:lang w:val="en-GB"/>
-        </w:rPr>
-      </w:pPr>
-      <w:r>
-        <w:rPr>
-          <w:rStyle w:val="SubtleEmphasis"/>
+        <w:pStyle w:val="Geenafstand"/>
+        <w:rPr>
+          <w:rStyle w:val="Subtielebenadrukking"/>
+          <w:sz w:val="18"/>
+          <w:szCs w:val="18"/>
+          <w:lang w:val="en-GB"/>
+        </w:rPr>
+      </w:pPr>
+      <w:r>
+        <w:rPr>
+          <w:rStyle w:val="Subtielebenadrukking"/>
           <w:sz w:val="18"/>
           <w:szCs w:val="18"/>
           <w:lang w:val="en-GB"/>
@@ -468,17 +445,17 @@
     </w:p>
     <w:p>
       <w:pPr>
-        <w:pStyle w:val="NoSpacing"/>
-        <w:rPr>
-          <w:rStyle w:val="SubtleEmphasis"/>
-          <w:sz w:val="18"/>
-          <w:szCs w:val="18"/>
-          <w:lang w:val="en-GB"/>
-        </w:rPr>
-      </w:pPr>
-      <w:r>
-        <w:rPr>
-          <w:rStyle w:val="SubtleEmphasis"/>
+        <w:pStyle w:val="Geenafstand"/>
+        <w:rPr>
+          <w:rStyle w:val="Subtielebenadrukking"/>
+          <w:sz w:val="18"/>
+          <w:szCs w:val="18"/>
+          <w:lang w:val="en-GB"/>
+        </w:rPr>
+      </w:pPr>
+      <w:r>
+        <w:rPr>
+          <w:rStyle w:val="Subtielebenadrukking"/>
           <w:sz w:val="18"/>
           <w:szCs w:val="18"/>
           <w:lang w:val="en-GB"/>
@@ -488,37 +465,37 @@
     </w:p>
     <w:p>
       <w:pPr>
-        <w:pStyle w:val="NoSpacing"/>
-        <w:rPr>
-          <w:rStyle w:val="SubtleEmphasis"/>
-          <w:sz w:val="18"/>
-          <w:szCs w:val="18"/>
-          <w:lang w:val="en-GB"/>
-        </w:rPr>
-      </w:pPr>
-      <w:r>
-        <w:rPr>
-          <w:rStyle w:val="SubtleEmphasis"/>
-          <w:sz w:val="18"/>
-          <w:szCs w:val="18"/>
-          <w:lang w:val="en-GB"/>
-        </w:rPr>
-        <w:t xml:space="preserve">    (10): ReLU()</w:t>
-      </w:r>
-    </w:p>
-    <w:p>
-      <w:pPr>
-        <w:pStyle w:val="NoSpacing"/>
-        <w:rPr>
-          <w:rStyle w:val="SubtleEmphasis"/>
-          <w:sz w:val="18"/>
-          <w:szCs w:val="18"/>
-          <w:lang w:val="en-GB"/>
-        </w:rPr>
-      </w:pPr>
-      <w:r>
-        <w:rPr>
-          <w:rStyle w:val="SubtleEmphasis"/>
+        <w:pStyle w:val="Geenafstand"/>
+        <w:rPr>
+          <w:rStyle w:val="Subtielebenadrukking"/>
+          <w:sz w:val="18"/>
+          <w:szCs w:val="18"/>
+          <w:lang w:val="en-GB"/>
+        </w:rPr>
+      </w:pPr>
+      <w:r>
+        <w:rPr>
+          <w:rStyle w:val="Subtielebenadrukking"/>
+          <w:sz w:val="18"/>
+          <w:szCs w:val="18"/>
+          <w:lang w:val="en-GB"/>
+        </w:rPr>
+        <w:t xml:space="preserve">    (10): LeakyReLU(negative_slope=0.1)</w:t>
+      </w:r>
+    </w:p>
+    <w:p>
+      <w:pPr>
+        <w:pStyle w:val="Geenafstand"/>
+        <w:rPr>
+          <w:rStyle w:val="Subtielebenadrukking"/>
+          <w:sz w:val="18"/>
+          <w:szCs w:val="18"/>
+          <w:lang w:val="en-GB"/>
+        </w:rPr>
+      </w:pPr>
+      <w:r>
+        <w:rPr>
+          <w:rStyle w:val="Subtielebenadrukking"/>
           <w:sz w:val="18"/>
           <w:szCs w:val="18"/>
           <w:lang w:val="en-GB"/>
@@ -528,17 +505,17 @@
     </w:p>
     <w:p>
       <w:pPr>
-        <w:pStyle w:val="NoSpacing"/>
-        <w:rPr>
-          <w:rStyle w:val="SubtleEmphasis"/>
-          <w:sz w:val="18"/>
-          <w:szCs w:val="18"/>
-          <w:lang w:val="en-GB"/>
-        </w:rPr>
-      </w:pPr>
-      <w:r>
-        <w:rPr>
-          <w:rStyle w:val="SubtleEmphasis"/>
+        <w:pStyle w:val="Geenafstand"/>
+        <w:rPr>
+          <w:rStyle w:val="Subtielebenadrukking"/>
+          <w:sz w:val="18"/>
+          <w:szCs w:val="18"/>
+          <w:lang w:val="en-GB"/>
+        </w:rPr>
+      </w:pPr>
+      <w:r>
+        <w:rPr>
+          <w:rStyle w:val="Subtielebenadrukking"/>
           <w:sz w:val="18"/>
           <w:szCs w:val="18"/>
           <w:lang w:val="en-GB"/>
@@ -548,17 +525,17 @@
     </w:p>
     <w:p>
       <w:pPr>
-        <w:pStyle w:val="NoSpacing"/>
-        <w:rPr>
-          <w:rStyle w:val="SubtleEmphasis"/>
-          <w:sz w:val="18"/>
-          <w:szCs w:val="18"/>
-          <w:lang w:val="en-GB"/>
-        </w:rPr>
-      </w:pPr>
-      <w:r>
-        <w:rPr>
-          <w:rStyle w:val="SubtleEmphasis"/>
+        <w:pStyle w:val="Geenafstand"/>
+        <w:rPr>
+          <w:rStyle w:val="Subtielebenadrukking"/>
+          <w:sz w:val="18"/>
+          <w:szCs w:val="18"/>
+          <w:lang w:val="en-GB"/>
+        </w:rPr>
+      </w:pPr>
+      <w:r>
+        <w:rPr>
+          <w:rStyle w:val="Subtielebenadrukking"/>
           <w:sz w:val="18"/>
           <w:szCs w:val="18"/>
           <w:lang w:val="en-GB"/>
@@ -568,37 +545,37 @@
     </w:p>
     <w:p>
       <w:pPr>
-        <w:pStyle w:val="NoSpacing"/>
-        <w:rPr>
-          <w:rStyle w:val="SubtleEmphasis"/>
-          <w:sz w:val="18"/>
-          <w:szCs w:val="18"/>
-          <w:lang w:val="en-GB"/>
-        </w:rPr>
-      </w:pPr>
-      <w:r>
-        <w:rPr>
-          <w:rStyle w:val="SubtleEmphasis"/>
-          <w:sz w:val="18"/>
-          <w:szCs w:val="18"/>
-          <w:lang w:val="en-GB"/>
-        </w:rPr>
-        <w:t xml:space="preserve">    (14): ReLU()</w:t>
-      </w:r>
-    </w:p>
-    <w:p>
-      <w:pPr>
-        <w:pStyle w:val="NoSpacing"/>
-        <w:rPr>
-          <w:rStyle w:val="SubtleEmphasis"/>
-          <w:sz w:val="18"/>
-          <w:szCs w:val="18"/>
-          <w:lang w:val="en-GB"/>
-        </w:rPr>
-      </w:pPr>
-      <w:r>
-        <w:rPr>
-          <w:rStyle w:val="SubtleEmphasis"/>
+        <w:pStyle w:val="Geenafstand"/>
+        <w:rPr>
+          <w:rStyle w:val="Subtielebenadrukking"/>
+          <w:sz w:val="18"/>
+          <w:szCs w:val="18"/>
+          <w:lang w:val="en-GB"/>
+        </w:rPr>
+      </w:pPr>
+      <w:r>
+        <w:rPr>
+          <w:rStyle w:val="Subtielebenadrukking"/>
+          <w:sz w:val="18"/>
+          <w:szCs w:val="18"/>
+          <w:lang w:val="en-GB"/>
+        </w:rPr>
+        <w:t xml:space="preserve">    (14): LeakyReLU(negative_slope=0.1)</w:t>
+      </w:r>
+    </w:p>
+    <w:p>
+      <w:pPr>
+        <w:pStyle w:val="Geenafstand"/>
+        <w:rPr>
+          <w:rStyle w:val="Subtielebenadrukking"/>
+          <w:sz w:val="18"/>
+          <w:szCs w:val="18"/>
+          <w:lang w:val="en-GB"/>
+        </w:rPr>
+      </w:pPr>
+      <w:r>
+        <w:rPr>
+          <w:rStyle w:val="Subtielebenadrukking"/>
           <w:sz w:val="18"/>
           <w:szCs w:val="18"/>
           <w:lang w:val="en-GB"/>
@@ -608,17 +585,17 @@
     </w:p>
     <w:p>
       <w:pPr>
-        <w:pStyle w:val="NoSpacing"/>
-        <w:rPr>
-          <w:rStyle w:val="SubtleEmphasis"/>
-          <w:sz w:val="18"/>
-          <w:szCs w:val="18"/>
-          <w:lang w:val="en-GB"/>
-        </w:rPr>
-      </w:pPr>
-      <w:r>
-        <w:rPr>
-          <w:rStyle w:val="SubtleEmphasis"/>
+        <w:pStyle w:val="Geenafstand"/>
+        <w:rPr>
+          <w:rStyle w:val="Subtielebenadrukking"/>
+          <w:sz w:val="18"/>
+          <w:szCs w:val="18"/>
+          <w:lang w:val="en-GB"/>
+        </w:rPr>
+      </w:pPr>
+      <w:r>
+        <w:rPr>
+          <w:rStyle w:val="Subtielebenadrukking"/>
           <w:sz w:val="18"/>
           <w:szCs w:val="18"/>
           <w:lang w:val="en-GB"/>
@@ -628,17 +605,17 @@
     </w:p>
     <w:p>
       <w:pPr>
-        <w:pStyle w:val="NoSpacing"/>
-        <w:rPr>
-          <w:rStyle w:val="SubtleEmphasis"/>
-          <w:sz w:val="18"/>
-          <w:szCs w:val="18"/>
-          <w:lang w:val="en-GB"/>
-        </w:rPr>
-      </w:pPr>
-      <w:r>
-        <w:rPr>
-          <w:rStyle w:val="SubtleEmphasis"/>
+        <w:pStyle w:val="Geenafstand"/>
+        <w:rPr>
+          <w:rStyle w:val="Subtielebenadrukking"/>
+          <w:sz w:val="18"/>
+          <w:szCs w:val="18"/>
+          <w:lang w:val="en-GB"/>
+        </w:rPr>
+      </w:pPr>
+      <w:r>
+        <w:rPr>
+          <w:rStyle w:val="Subtielebenadrukking"/>
           <w:sz w:val="18"/>
           <w:szCs w:val="18"/>
           <w:lang w:val="en-GB"/>
@@ -648,157 +625,37 @@
     </w:p>
     <w:p>
       <w:pPr>
-        <w:pStyle w:val="NoSpacing"/>
-        <w:rPr>
-          <w:rStyle w:val="SubtleEmphasis"/>
-          <w:sz w:val="18"/>
-          <w:szCs w:val="18"/>
-          <w:lang w:val="en-GB"/>
-        </w:rPr>
-      </w:pPr>
-      <w:r>
-        <w:rPr>
-          <w:rStyle w:val="SubtleEmphasis"/>
-          <w:sz w:val="18"/>
-          <w:szCs w:val="18"/>
-          <w:lang w:val="en-GB"/>
-        </w:rPr>
-        <w:t xml:space="preserve">    (18): ReLU()</w:t>
-      </w:r>
-    </w:p>
-    <w:p>
-      <w:pPr>
-        <w:pStyle w:val="NoSpacing"/>
-        <w:rPr>
-          <w:rStyle w:val="SubtleEmphasis"/>
-          <w:sz w:val="18"/>
-          <w:szCs w:val="18"/>
-          <w:lang w:val="en-GB"/>
-        </w:rPr>
-      </w:pPr>
-      <w:r>
-        <w:rPr>
-          <w:rStyle w:val="SubtleEmphasis"/>
-          <w:sz w:val="18"/>
-          <w:szCs w:val="18"/>
-          <w:lang w:val="en-GB"/>
-        </w:rPr>
-        <w:t xml:space="preserve">    (19): Flatten(start_dim=1, end_dim=-1)</w:t>
-      </w:r>
-    </w:p>
-    <w:p>
-      <w:pPr>
-        <w:pStyle w:val="NoSpacing"/>
-        <w:rPr>
-          <w:rStyle w:val="SubtleEmphasis"/>
-          <w:sz w:val="18"/>
-          <w:szCs w:val="18"/>
-          <w:lang w:val="en-GB"/>
-        </w:rPr>
-      </w:pPr>
-      <w:r>
-        <w:rPr>
-          <w:rStyle w:val="SubtleEmphasis"/>
-          <w:sz w:val="18"/>
-          <w:szCs w:val="18"/>
-          <w:lang w:val="en-GB"/>
-        </w:rPr>
-        <w:t xml:space="preserve">    (20): Dropout(p=0.2, inplace=False)</w:t>
-      </w:r>
-    </w:p>
-    <w:p>
-      <w:pPr>
-        <w:pStyle w:val="NoSpacing"/>
-        <w:rPr>
-          <w:rStyle w:val="SubtleEmphasis"/>
-          <w:sz w:val="18"/>
-          <w:szCs w:val="18"/>
-          <w:lang w:val="en-GB"/>
-        </w:rPr>
-      </w:pPr>
-      <w:r>
-        <w:rPr>
-          <w:rStyle w:val="SubtleEmphasis"/>
-          <w:sz w:val="18"/>
-          <w:szCs w:val="18"/>
-          <w:lang w:val="en-GB"/>
-        </w:rPr>
-        <w:t xml:space="preserve">    (21): Linear(in_features=1568, out_features=512, bias=True)</w:t>
-      </w:r>
-    </w:p>
-    <w:p>
-      <w:pPr>
-        <w:pStyle w:val="NoSpacing"/>
-        <w:rPr>
-          <w:rStyle w:val="SubtleEmphasis"/>
-          <w:sz w:val="18"/>
-          <w:szCs w:val="18"/>
-          <w:lang w:val="en-GB"/>
-        </w:rPr>
-      </w:pPr>
-      <w:r>
-        <w:rPr>
-          <w:rStyle w:val="SubtleEmphasis"/>
-          <w:sz w:val="18"/>
-          <w:szCs w:val="18"/>
-          <w:lang w:val="en-GB"/>
-        </w:rPr>
-        <w:t xml:space="preserve">    (22): ReLU()</w:t>
-      </w:r>
-    </w:p>
-    <w:p>
-      <w:pPr>
-        <w:pStyle w:val="NoSpacing"/>
-        <w:rPr>
-          <w:rStyle w:val="SubtleEmphasis"/>
-          <w:sz w:val="18"/>
-          <w:szCs w:val="18"/>
-          <w:lang w:val="en-GB"/>
-        </w:rPr>
-      </w:pPr>
-      <w:r>
-        <w:rPr>
-          <w:rStyle w:val="SubtleEmphasis"/>
-          <w:sz w:val="18"/>
-          <w:szCs w:val="18"/>
-          <w:lang w:val="en-GB"/>
-        </w:rPr>
-        <w:t xml:space="preserve">    (23): Linear(in_features=512, out_features=343, bias=True)</w:t>
-      </w:r>
-    </w:p>
-    <w:p>
-      <w:pPr>
-        <w:pStyle w:val="NoSpacing"/>
-        <w:rPr>
-          <w:rStyle w:val="SubtleEmphasis"/>
-          <w:sz w:val="18"/>
-          <w:szCs w:val="18"/>
-          <w:lang w:val="en-GB"/>
-        </w:rPr>
-      </w:pPr>
-      <w:r>
-        <w:rPr>
-          <w:rStyle w:val="SubtleEmphasis"/>
-          <w:sz w:val="18"/>
-          <w:szCs w:val="18"/>
-          <w:lang w:val="en-GB"/>
-        </w:rPr>
-        <w:t xml:space="preserve">    (24): Sigmoid()</w:t>
-      </w:r>
-    </w:p>
-    <w:p>
-      <w:pPr>
-        <w:pStyle w:val="NoSpacing"/>
-        <w:rPr>
-          <w:rStyle w:val="SubtleEmphasis"/>
-          <w:sz w:val="18"/>
-          <w:szCs w:val="18"/>
-          <w:lang w:val="en-GB"/>
-        </w:rPr>
-      </w:pPr>
-      <w:r>
-        <w:rPr>
-          <w:rStyle w:val="SubtleEmphasis"/>
+        <w:pStyle w:val="Geenafstand"/>
+        <w:rPr>
+          <w:rStyle w:val="Subtielebenadrukking"/>
+          <w:sz w:val="18"/>
+          <w:szCs w:val="18"/>
+          <w:lang w:val="en-GB"/>
+        </w:rPr>
+      </w:pPr>
+      <w:r>
+        <w:rPr>
+          <w:rStyle w:val="Subtielebenadrukking"/>
+          <w:sz w:val="18"/>
+          <w:szCs w:val="18"/>
+          <w:lang w:val="en-GB"/>
+        </w:rPr>
+        <w:t xml:space="preserve">    (18): LeakyReLU(negative_slope=0.1)</w:t>
+      </w:r>
+    </w:p>
+    <w:p>
+      <w:pPr>
+        <w:pStyle w:val="Geenafstand"/>
+        <w:rPr>
+          <w:rStyle w:val="Subtielebenadrukking"/>
+          <w:sz w:val="18"/>
+          <w:szCs w:val="18"/>
+          <w:lang w:val="en-GB"/>
+        </w:rPr>
+      </w:pPr>
+      <w:r>
+        <w:rPr>
+          <w:rStyle w:val="Subtielebenadrukking"/>
           <w:sz w:val="18"/>
           <w:szCs w:val="18"/>
           <w:lang w:val="en-GB"/>
@@ -808,31 +665,180 @@
     </w:p>
     <w:p>
       <w:pPr>
-        <w:pStyle w:val="NoSpacing"/>
-        <w:rPr>
-          <w:rStyle w:val="SubtleEmphasis"/>
-          <w:sz w:val="18"/>
-          <w:szCs w:val="18"/>
-          <w:lang w:val="en-GB"/>
-        </w:rPr>
-      </w:pPr>
-      <w:r>
-        <w:rPr>
-          <w:rStyle w:val="SubtleEmphasis"/>
+        <w:pStyle w:val="Geenafstand"/>
+        <w:rPr>
+          <w:rStyle w:val="Subtielebenadrukking"/>
+          <w:sz w:val="18"/>
+          <w:szCs w:val="18"/>
+          <w:lang w:val="en-GB"/>
+        </w:rPr>
+      </w:pPr>
+      <w:r>
+        <w:rPr>
+          <w:rStyle w:val="Subtielebenadrukking"/>
+          <w:sz w:val="18"/>
+          <w:szCs w:val="18"/>
+          <w:lang w:val="en-GB"/>
+        </w:rPr>
+        <w:t xml:space="preserve">  (head): Sequential(</w:t>
+      </w:r>
+    </w:p>
+    <w:p>
+      <w:pPr>
+        <w:pStyle w:val="Geenafstand"/>
+        <w:rPr>
+          <w:rStyle w:val="Subtielebenadrukking"/>
+          <w:sz w:val="18"/>
+          <w:szCs w:val="18"/>
+          <w:lang w:val="en-GB"/>
+        </w:rPr>
+      </w:pPr>
+      <w:r>
+        <w:rPr>
+          <w:rStyle w:val="Subtielebenadrukking"/>
+          <w:sz w:val="18"/>
+          <w:szCs w:val="18"/>
+          <w:lang w:val="en-GB"/>
+        </w:rPr>
+        <w:t xml:space="preserve">    (0): Flatten(start_dim=1, end_dim=-1)</w:t>
+      </w:r>
+    </w:p>
+    <w:p>
+      <w:pPr>
+        <w:pStyle w:val="Geenafstand"/>
+        <w:rPr>
+          <w:rStyle w:val="Subtielebenadrukking"/>
+          <w:sz w:val="18"/>
+          <w:szCs w:val="18"/>
+          <w:lang w:val="en-GB"/>
+        </w:rPr>
+      </w:pPr>
+      <w:r>
+        <w:rPr>
+          <w:rStyle w:val="Subtielebenadrukking"/>
+          <w:sz w:val="18"/>
+          <w:szCs w:val="18"/>
+          <w:lang w:val="en-GB"/>
+        </w:rPr>
+        <w:t xml:space="preserve">    (1): Dropout(p=0.5, inplace=False)</w:t>
+      </w:r>
+    </w:p>
+    <w:p>
+      <w:pPr>
+        <w:pStyle w:val="Geenafstand"/>
+        <w:rPr>
+          <w:rStyle w:val="Subtielebenadrukking"/>
+          <w:sz w:val="18"/>
+          <w:szCs w:val="18"/>
+          <w:lang w:val="en-GB"/>
+        </w:rPr>
+      </w:pPr>
+      <w:r>
+        <w:rPr>
+          <w:rStyle w:val="Subtielebenadrukking"/>
+          <w:sz w:val="18"/>
+          <w:szCs w:val="18"/>
+          <w:lang w:val="en-GB"/>
+        </w:rPr>
+        <w:t xml:space="preserve">    (2): Linear(in_features=1568, out_features=512, bias=True)</w:t>
+      </w:r>
+    </w:p>
+    <w:p>
+      <w:pPr>
+        <w:pStyle w:val="Geenafstand"/>
+        <w:rPr>
+          <w:rStyle w:val="Subtielebenadrukking"/>
+          <w:sz w:val="18"/>
+          <w:szCs w:val="18"/>
+          <w:lang w:val="en-GB"/>
+        </w:rPr>
+      </w:pPr>
+      <w:r>
+        <w:rPr>
+          <w:rStyle w:val="Subtielebenadrukking"/>
+          <w:sz w:val="18"/>
+          <w:szCs w:val="18"/>
+          <w:lang w:val="en-GB"/>
+        </w:rPr>
+        <w:t xml:space="preserve">    (3): LeakyReLU(negative_slope=0.1)</w:t>
+      </w:r>
+    </w:p>
+    <w:p>
+      <w:pPr>
+        <w:pStyle w:val="Geenafstand"/>
+        <w:rPr>
+          <w:rStyle w:val="Subtielebenadrukking"/>
+          <w:sz w:val="18"/>
+          <w:szCs w:val="18"/>
+          <w:lang w:val="en-GB"/>
+        </w:rPr>
+      </w:pPr>
+      <w:r>
+        <w:rPr>
+          <w:rStyle w:val="Subtielebenadrukking"/>
+          <w:sz w:val="18"/>
+          <w:szCs w:val="18"/>
+          <w:lang w:val="en-GB"/>
+        </w:rPr>
+        <w:t xml:space="preserve">    (4): Linear(in_features=512, out_features=343, bias=True)</w:t>
+      </w:r>
+    </w:p>
+    <w:p>
+      <w:pPr>
+        <w:pStyle w:val="Geenafstand"/>
+        <w:rPr>
+          <w:rStyle w:val="Subtielebenadrukking"/>
+          <w:sz w:val="18"/>
+          <w:szCs w:val="18"/>
+          <w:lang w:val="en-GB"/>
+        </w:rPr>
+      </w:pPr>
+      <w:r>
+        <w:rPr>
+          <w:rStyle w:val="Subtielebenadrukking"/>
+          <w:sz w:val="18"/>
+          <w:szCs w:val="18"/>
+          <w:lang w:val="en-GB"/>
+        </w:rPr>
+        <w:t xml:space="preserve">    (5): Sigmoid()</w:t>
+      </w:r>
+    </w:p>
+    <w:p>
+      <w:pPr>
+        <w:pStyle w:val="Geenafstand"/>
+        <w:rPr>
+          <w:rStyle w:val="Subtielebenadrukking"/>
+          <w:sz w:val="18"/>
+          <w:szCs w:val="18"/>
+          <w:lang w:val="en-GB"/>
+        </w:rPr>
+      </w:pPr>
+      <w:r>
+        <w:rPr>
+          <w:rStyle w:val="Subtielebenadrukking"/>
+          <w:sz w:val="18"/>
+          <w:szCs w:val="18"/>
+          <w:lang w:val="en-GB"/>
+        </w:rPr>
+        <w:t xml:space="preserve">  )</w:t>
+      </w:r>
+    </w:p>
+    <w:p>
+      <w:pPr>
+        <w:pStyle w:val="Geenafstand"/>
+        <w:rPr>
+          <w:lang w:val="en-GB"/>
+        </w:rPr>
+      </w:pPr>
+      <w:r>
+        <w:rPr>
+          <w:rStyle w:val="Subtielebenadrukking"/>
           <w:sz w:val="18"/>
           <w:szCs w:val="18"/>
           <w:lang w:val="en-GB"/>
         </w:rPr>
         <w:t>)</w:t>
       </w:r>
-    </w:p>
-    <w:p>
-      <w:pPr>
-        <w:pStyle w:val="NoSpacing"/>
-        <w:rPr>
-          <w:lang w:val="en-GB"/>
-        </w:rPr>
-      </w:pPr>
     </w:p>
     <w:p>
       <w:pPr>
@@ -857,7 +863,7 @@
     </w:p>
     <w:p>
       <w:pPr>
-        <w:pStyle w:val="NoSpacing"/>
+        <w:pStyle w:val="Geenafstand"/>
         <w:rPr>
           <w:b/>
           <w:bCs/>
@@ -880,7 +886,7 @@
     </w:p>
     <w:p>
       <w:pPr>
-        <w:pStyle w:val="NoSpacing"/>
+        <w:pStyle w:val="Geenafstand"/>
         <w:rPr>
           <w:lang w:val="en-GB"/>
         </w:rPr>
@@ -923,7 +929,7 @@
     </w:p>
     <w:p>
       <w:pPr>
-        <w:pStyle w:val="NoSpacing"/>
+        <w:pStyle w:val="Geenafstand"/>
         <w:rPr>
           <w:lang w:val="en-GB"/>
         </w:rPr>
@@ -1711,7 +1717,7 @@
     </w:p>
     <w:p>
       <w:pPr>
-        <w:pStyle w:val="NoSpacing"/>
+        <w:pStyle w:val="Geenafstand"/>
         <w:rPr>
           <w:lang w:val="en-GB"/>
         </w:rPr>
@@ -1852,15 +1858,15 @@
     </w:p>
     <w:p>
       <w:pPr>
-        <w:pStyle w:val="NoSpacing"/>
-        <w:rPr>
-          <w:lang w:val="en-GB"/>
-        </w:rPr>
-      </w:pPr>
-    </w:p>
-    <w:p>
-      <w:pPr>
-        <w:pStyle w:val="NoSpacing"/>
+        <w:pStyle w:val="Geenafstand"/>
+        <w:rPr>
+          <w:lang w:val="en-GB"/>
+        </w:rPr>
+      </w:pPr>
+    </w:p>
+    <w:p>
+      <w:pPr>
+        <w:pStyle w:val="Geenafstand"/>
         <w:rPr>
           <w:b/>
           <w:bCs/>
@@ -1882,7 +1888,7 @@
     </w:p>
     <w:p>
       <w:pPr>
-        <w:pStyle w:val="NoSpacing"/>
+        <w:pStyle w:val="Geenafstand"/>
         <w:rPr>
           <w:lang w:val="en-GB"/>
         </w:rPr>
@@ -1897,7 +1903,7 @@
     </w:p>
     <w:tbl>
       <w:tblPr>
-        <w:tblStyle w:val="TableGrid"/>
+        <w:tblStyle w:val="Tabelraster"/>
         <w:tblW w:w="0" w:type="auto"/>
         <w:tblLook w:val="04A0" w:firstRow="1" w:lastRow="0" w:firstColumn="1" w:lastColumn="0" w:noHBand="0" w:noVBand="1"/>
       </w:tblPr>
@@ -1912,7 +1918,7 @@
           </w:tcPr>
           <w:p>
             <w:pPr>
-              <w:pStyle w:val="NoSpacing"/>
+              <w:pStyle w:val="Geenafstand"/>
               <w:rPr>
                 <w:b/>
                 <w:sz w:val="24"/>
@@ -1937,7 +1943,7 @@
           </w:tcPr>
           <w:p>
             <w:pPr>
-              <w:pStyle w:val="NoSpacing"/>
+              <w:pStyle w:val="Geenafstand"/>
               <w:rPr>
                 <w:b/>
                 <w:sz w:val="24"/>
@@ -1964,7 +1970,7 @@
           </w:tcPr>
           <w:p>
             <w:pPr>
-              <w:pStyle w:val="NoSpacing"/>
+              <w:pStyle w:val="Geenafstand"/>
               <w:rPr>
                 <w:sz w:val="24"/>
                 <w:szCs w:val="24"/>
@@ -1987,11 +1993,10 @@
           </w:tcPr>
           <w:p>
             <w:pPr>
-              <w:pStyle w:val="NoSpacing"/>
+              <w:pStyle w:val="Geenafstand"/>
               <w:rPr>
                 <w:sz w:val="24"/>
                 <w:szCs w:val="24"/>
-                <w:highlight w:val="yellow"/>
                 <w:lang w:val="en-GB"/>
               </w:rPr>
             </w:pPr>
@@ -1999,10 +2004,9 @@
               <w:rPr>
                 <w:sz w:val="24"/>
                 <w:szCs w:val="24"/>
-                <w:highlight w:val="yellow"/>
-                <w:lang w:val="en-GB"/>
-              </w:rPr>
-              <w:t>…</w:t>
+                <w:lang w:val="en-GB"/>
+              </w:rPr>
+              <w:t>.0001</w:t>
             </w:r>
           </w:p>
         </w:tc>
@@ -2014,7 +2018,7 @@
           </w:tcPr>
           <w:p>
             <w:pPr>
-              <w:pStyle w:val="NoSpacing"/>
+              <w:pStyle w:val="Geenafstand"/>
               <w:rPr>
                 <w:sz w:val="24"/>
                 <w:szCs w:val="24"/>
@@ -2037,7 +2041,7 @@
           </w:tcPr>
           <w:p>
             <w:pPr>
-              <w:pStyle w:val="NoSpacing"/>
+              <w:pStyle w:val="Geenafstand"/>
               <w:rPr>
                 <w:sz w:val="24"/>
                 <w:szCs w:val="24"/>
@@ -2049,10 +2053,9 @@
               <w:rPr>
                 <w:sz w:val="24"/>
                 <w:szCs w:val="24"/>
-                <w:highlight w:val="yellow"/>
-                <w:lang w:val="en-GB"/>
-              </w:rPr>
-              <w:t>…</w:t>
+                <w:lang w:val="en-GB"/>
+              </w:rPr>
+              <w:t>Adam with a weight decay of 0.0001</w:t>
             </w:r>
           </w:p>
         </w:tc>
@@ -2067,7 +2070,7 @@
           </w:tcPr>
           <w:p>
             <w:pPr>
-              <w:pStyle w:val="NoSpacing"/>
+              <w:pStyle w:val="Geenafstand"/>
               <w:rPr>
                 <w:sz w:val="24"/>
                 <w:szCs w:val="24"/>
@@ -2093,7 +2096,7 @@
           </w:tcPr>
           <w:p>
             <w:pPr>
-              <w:pStyle w:val="NoSpacing"/>
+              <w:pStyle w:val="Geenafstand"/>
               <w:rPr>
                 <w:sz w:val="24"/>
                 <w:szCs w:val="24"/>
@@ -2105,10 +2108,9 @@
               <w:rPr>
                 <w:sz w:val="24"/>
                 <w:szCs w:val="24"/>
-                <w:highlight w:val="yellow"/>
-                <w:lang w:val="en-GB"/>
-              </w:rPr>
-              <w:t>…</w:t>
+                <w:lang w:val="en-GB"/>
+              </w:rPr>
+              <w:t>8</w:t>
             </w:r>
           </w:p>
         </w:tc>
@@ -2116,15 +2118,15 @@
     </w:tbl>
     <w:p>
       <w:pPr>
-        <w:pStyle w:val="NoSpacing"/>
-        <w:rPr>
-          <w:lang w:val="en-GB"/>
-        </w:rPr>
-      </w:pPr>
-    </w:p>
-    <w:p>
-      <w:pPr>
-        <w:pStyle w:val="NoSpacing"/>
+        <w:pStyle w:val="Geenafstand"/>
+        <w:rPr>
+          <w:lang w:val="en-GB"/>
+        </w:rPr>
+      </w:pPr>
+    </w:p>
+    <w:p>
+      <w:pPr>
+        <w:pStyle w:val="Geenafstand"/>
         <w:rPr>
           <w:b/>
           <w:sz w:val="24"/>
@@ -2142,7 +2144,7 @@
     </w:p>
     <w:p>
       <w:pPr>
-        <w:pStyle w:val="NoSpacing"/>
+        <w:pStyle w:val="Geenafstand"/>
         <w:rPr>
           <w:lang w:val="en-GB"/>
         </w:rPr>
@@ -2209,26 +2211,21 @@
     </w:p>
     <w:p>
       <w:pPr>
-        <w:pStyle w:val="NoSpacing"/>
-        <w:keepNext/>
-        <w:jc w:val="center"/>
-        <w:rPr>
-          <w:lang w:val="en-GB"/>
-        </w:rPr>
-      </w:pPr>
-      <w:r>
-        <w:rPr>
-          <w:bCs/>
-          <w:noProof/>
-          <w:sz w:val="24"/>
+        <w:pStyle w:val="Geenafstand"/>
+        <w:rPr>
+          <w:lang w:val="en-GB"/>
+        </w:rPr>
+      </w:pPr>
+      <w:r>
+        <w:rPr>
           <w:lang w:val="en-GB"/>
         </w:rPr>
         <w:lastRenderedPageBreak/>
         <w:drawing>
-          <wp:inline distT="0" distB="0" distL="0" distR="0" wp14:anchorId="4402E53D" wp14:editId="619CAB11">
-            <wp:extent cx="5731510" cy="7642225"/>
-            <wp:effectExtent l="0" t="0" r="2540" b="0"/>
-            <wp:docPr id="325298255" name="Picture 1" descr="A group of graphs with numbers&#10;&#10;AI-generated content may be incorrect."/>
+          <wp:inline distT="0" distB="0" distL="0" distR="0" wp14:anchorId="56D64E6A" wp14:editId="66BEFFE2">
+            <wp:extent cx="5731510" cy="4298950"/>
+            <wp:effectExtent l="0" t="0" r="2540" b="6350"/>
+            <wp:docPr id="1181861221" name="Afbeelding 1"/>
             <wp:cNvGraphicFramePr>
               <a:graphicFrameLocks xmlns:a="http://schemas.openxmlformats.org/drawingml/2006/main" noChangeAspect="1"/>
             </wp:cNvGraphicFramePr>
@@ -2236,11 +2233,11 @@
               <a:graphicData uri="http://schemas.openxmlformats.org/drawingml/2006/picture">
                 <pic:pic xmlns:pic="http://schemas.openxmlformats.org/drawingml/2006/picture">
                   <pic:nvPicPr>
-                    <pic:cNvPr id="325298255" name="Picture 1" descr="A group of graphs with numbers&#10;&#10;AI-generated content may be incorrect."/>
+                    <pic:cNvPr id="1181861221" name=""/>
                     <pic:cNvPicPr/>
                   </pic:nvPicPr>
                   <pic:blipFill>
-                    <a:blip r:embed="rId9"/>
+                    <a:blip r:embed="rId5"/>
                     <a:stretch>
                       <a:fillRect/>
                     </a:stretch>
@@ -2248,7 +2245,7 @@
                   <pic:spPr>
                     <a:xfrm>
                       <a:off x="0" y="0"/>
-                      <a:ext cx="5731510" cy="7642225"/>
+                      <a:ext cx="5731510" cy="4298950"/>
                     </a:xfrm>
                     <a:prstGeom prst="rect">
                       <a:avLst/>
@@ -2263,7 +2260,67 @@
     </w:p>
     <w:p>
       <w:pPr>
-        <w:pStyle w:val="Caption"/>
+        <w:pStyle w:val="Geenafstand"/>
+        <w:keepNext/>
+        <w:jc w:val="center"/>
+        <w:rPr>
+          <w:lang w:val="en-GB"/>
+        </w:rPr>
+      </w:pPr>
+      <w:r>
+        <w:rPr>
+          <w:bCs/>
+          <w:noProof/>
+          <w:sz w:val="24"/>
+          <w:lang w:val="en-GB"/>
+        </w:rPr>
+        <w:lastRenderedPageBreak/>
+        <w:drawing>
+          <wp:inline distT="0" distB="0" distL="0" distR="0" wp14:anchorId="4402E53D" wp14:editId="3C0DA0F3">
+            <wp:extent cx="5731510" cy="7642013"/>
+            <wp:effectExtent l="0" t="0" r="2540" b="0"/>
+            <wp:docPr id="325298255" name="Picture 1"/>
+            <wp:cNvGraphicFramePr>
+              <a:graphicFrameLocks xmlns:a="http://schemas.openxmlformats.org/drawingml/2006/main" noChangeAspect="1"/>
+            </wp:cNvGraphicFramePr>
+            <a:graphic xmlns:a="http://schemas.openxmlformats.org/drawingml/2006/main">
+              <a:graphicData uri="http://schemas.openxmlformats.org/drawingml/2006/picture">
+                <pic:pic xmlns:pic="http://schemas.openxmlformats.org/drawingml/2006/picture">
+                  <pic:nvPicPr>
+                    <pic:cNvPr id="325298255" name="Picture 1"/>
+                    <pic:cNvPicPr/>
+                  </pic:nvPicPr>
+                  <pic:blipFill>
+                    <a:blip r:embed="rId6">
+                      <a:extLst>
+                        <a:ext uri="{28A0092B-C50C-407E-A947-70E740481C1C}">
+                          <a14:useLocalDpi xmlns:a14="http://schemas.microsoft.com/office/drawing/2010/main" val="0"/>
+                        </a:ext>
+                      </a:extLst>
+                    </a:blip>
+                    <a:stretch>
+                      <a:fillRect/>
+                    </a:stretch>
+                  </pic:blipFill>
+                  <pic:spPr>
+                    <a:xfrm>
+                      <a:off x="0" y="0"/>
+                      <a:ext cx="5731510" cy="7642013"/>
+                    </a:xfrm>
+                    <a:prstGeom prst="rect">
+                      <a:avLst/>
+                    </a:prstGeom>
+                  </pic:spPr>
+                </pic:pic>
+              </a:graphicData>
+            </a:graphic>
+          </wp:inline>
+        </w:drawing>
+      </w:r>
+    </w:p>
+    <w:p>
+      <w:pPr>
+        <w:pStyle w:val="Bijschrift"/>
         <w:jc w:val="center"/>
         <w:rPr>
           <w:bCs/>
@@ -2271,7 +2328,7 @@
           <w:lang w:val="en-GB"/>
         </w:rPr>
       </w:pPr>
-      <w:bookmarkStart w:id="1" w:name="_Ref225240341"/>
+      <w:bookmarkStart w:id="0" w:name="_Ref225240341"/>
       <w:r>
         <w:rPr>
           <w:lang w:val="en-GB"/>
@@ -2309,7 +2366,7 @@
         </w:rPr>
         <w:fldChar w:fldCharType="end"/>
       </w:r>
-      <w:bookmarkEnd w:id="1"/>
+      <w:bookmarkEnd w:id="0"/>
       <w:r>
         <w:rPr>
           <w:lang w:val="en-GB"/>
@@ -2319,7 +2376,7 @@
     </w:p>
     <w:p>
       <w:pPr>
-        <w:pStyle w:val="NoSpacing"/>
+        <w:pStyle w:val="Geenafstand"/>
         <w:rPr>
           <w:lang w:val="en-GB"/>
         </w:rPr>
@@ -2384,15 +2441,15 @@
     </w:p>
     <w:p>
       <w:pPr>
-        <w:pStyle w:val="NoSpacing"/>
-        <w:rPr>
-          <w:lang w:val="en-GB"/>
-        </w:rPr>
-      </w:pPr>
-    </w:p>
-    <w:p>
-      <w:pPr>
-        <w:pStyle w:val="NoSpacing"/>
+        <w:pStyle w:val="Geenafstand"/>
+        <w:rPr>
+          <w:lang w:val="en-GB"/>
+        </w:rPr>
+      </w:pPr>
+    </w:p>
+    <w:p>
+      <w:pPr>
+        <w:pStyle w:val="Geenafstand"/>
         <w:rPr>
           <w:b/>
           <w:sz w:val="24"/>
@@ -2442,7 +2499,7 @@
     </w:p>
     <w:p>
       <w:pPr>
-        <w:pStyle w:val="NoSpacing"/>
+        <w:pStyle w:val="Geenafstand"/>
         <w:rPr>
           <w:lang w:val="en-GB"/>
         </w:rPr>
@@ -2479,7 +2536,7 @@
     </w:p>
     <w:tbl>
       <w:tblPr>
-        <w:tblStyle w:val="TableGrid"/>
+        <w:tblStyle w:val="Tabelraster"/>
         <w:tblW w:w="0" w:type="auto"/>
         <w:tblLook w:val="04A0" w:firstRow="1" w:lastRow="0" w:firstColumn="1" w:lastColumn="0" w:noHBand="0" w:noVBand="1"/>
       </w:tblPr>
@@ -2494,7 +2551,7 @@
           </w:tcPr>
           <w:p>
             <w:pPr>
-              <w:pStyle w:val="NoSpacing"/>
+              <w:pStyle w:val="Geenafstand"/>
               <w:rPr>
                 <w:b/>
                 <w:sz w:val="24"/>
@@ -2502,7 +2559,7 @@
                 <w:lang w:val="en-GB"/>
               </w:rPr>
             </w:pPr>
-            <w:commentRangeStart w:id="2"/>
+            <w:commentRangeStart w:id="1"/>
             <w:r>
               <w:rPr>
                 <w:b/>
@@ -2512,16 +2569,16 @@
               </w:rPr>
               <w:t>Setting</w:t>
             </w:r>
-            <w:commentRangeEnd w:id="2"/>
+            <w:commentRangeEnd w:id="1"/>
             <w:r>
               <w:rPr>
-                <w:rStyle w:val="CommentReference"/>
+                <w:rStyle w:val="Verwijzingopmerking"/>
                 <w:b/>
                 <w:sz w:val="24"/>
                 <w:szCs w:val="24"/>
                 <w:lang w:val="en-GB"/>
               </w:rPr>
-              <w:commentReference w:id="2"/>
+              <w:commentReference w:id="1"/>
             </w:r>
           </w:p>
         </w:tc>
@@ -2531,7 +2588,7 @@
           </w:tcPr>
           <w:p>
             <w:pPr>
-              <w:pStyle w:val="NoSpacing"/>
+              <w:pStyle w:val="Geenafstand"/>
               <w:rPr>
                 <w:b/>
                 <w:sz w:val="24"/>
@@ -2558,7 +2615,7 @@
           </w:tcPr>
           <w:p>
             <w:pPr>
-              <w:pStyle w:val="NoSpacing"/>
+              <w:pStyle w:val="Geenafstand"/>
               <w:rPr>
                 <w:sz w:val="24"/>
                 <w:szCs w:val="24"/>
@@ -2581,7 +2638,10 @@
           </w:tcPr>
           <w:p>
             <w:pPr>
-              <w:pStyle w:val="NoSpacing"/>
+              <w:pStyle w:val="Geenafstand"/>
+              <w:tabs>
+                <w:tab w:val="left" w:pos="705"/>
+              </w:tabs>
               <w:rPr>
                 <w:sz w:val="24"/>
                 <w:szCs w:val="24"/>
@@ -2592,10 +2652,9 @@
               <w:rPr>
                 <w:sz w:val="24"/>
                 <w:szCs w:val="24"/>
-                <w:highlight w:val="yellow"/>
-                <w:lang w:val="en-GB"/>
-              </w:rPr>
-              <w:t>…</w:t>
+                <w:lang w:val="en-GB"/>
+              </w:rPr>
+              <w:t>94.61%</w:t>
             </w:r>
           </w:p>
         </w:tc>
@@ -2607,7 +2666,7 @@
           </w:tcPr>
           <w:p>
             <w:pPr>
-              <w:pStyle w:val="NoSpacing"/>
+              <w:pStyle w:val="Geenafstand"/>
               <w:rPr>
                 <w:sz w:val="24"/>
                 <w:szCs w:val="24"/>
@@ -2630,7 +2689,7 @@
           </w:tcPr>
           <w:p>
             <w:pPr>
-              <w:pStyle w:val="NoSpacing"/>
+              <w:pStyle w:val="Geenafstand"/>
               <w:rPr>
                 <w:sz w:val="24"/>
                 <w:szCs w:val="24"/>
@@ -2641,10 +2700,9 @@
               <w:rPr>
                 <w:sz w:val="24"/>
                 <w:szCs w:val="24"/>
-                <w:highlight w:val="yellow"/>
-                <w:lang w:val="en-GB"/>
-              </w:rPr>
-              <w:t>…</w:t>
+                <w:lang w:val="en-GB"/>
+              </w:rPr>
+              <w:t>27.32%</w:t>
             </w:r>
           </w:p>
         </w:tc>
@@ -2659,7 +2717,7 @@
           </w:tcPr>
           <w:p>
             <w:pPr>
-              <w:pStyle w:val="NoSpacing"/>
+              <w:pStyle w:val="Geenafstand"/>
               <w:rPr>
                 <w:sz w:val="24"/>
                 <w:szCs w:val="24"/>
@@ -2685,7 +2743,7 @@
           </w:tcPr>
           <w:p>
             <w:pPr>
-              <w:pStyle w:val="NoSpacing"/>
+              <w:pStyle w:val="Geenafstand"/>
               <w:rPr>
                 <w:sz w:val="24"/>
                 <w:szCs w:val="24"/>
@@ -2696,10 +2754,9 @@
               <w:rPr>
                 <w:sz w:val="24"/>
                 <w:szCs w:val="24"/>
-                <w:highlight w:val="yellow"/>
-                <w:lang w:val="en-GB"/>
-              </w:rPr>
-              <w:t>…</w:t>
+                <w:lang w:val="en-GB"/>
+              </w:rPr>
+              <w:t>30.55%</w:t>
             </w:r>
           </w:p>
         </w:tc>
@@ -2707,15 +2764,15 @@
     </w:tbl>
     <w:p>
       <w:pPr>
-        <w:pStyle w:val="NoSpacing"/>
-        <w:rPr>
-          <w:lang w:val="en-GB"/>
-        </w:rPr>
-      </w:pPr>
-    </w:p>
-    <w:p>
-      <w:pPr>
-        <w:pStyle w:val="NoSpacing"/>
+        <w:pStyle w:val="Geenafstand"/>
+        <w:rPr>
+          <w:lang w:val="en-GB"/>
+        </w:rPr>
+      </w:pPr>
+    </w:p>
+    <w:p>
+      <w:pPr>
+        <w:pStyle w:val="Geenafstand"/>
         <w:rPr>
           <w:b/>
           <w:bCs/>
@@ -2737,7 +2794,7 @@
     </w:p>
     <w:p>
       <w:pPr>
-        <w:pStyle w:val="NoSpacing"/>
+        <w:pStyle w:val="Geenafstand"/>
         <w:rPr>
           <w:lang w:val="en-GB"/>
         </w:rPr>
@@ -2762,11 +2819,31 @@
           <w:lang w:val="en-GB"/>
         </w:rPr>
         <w:t>)</w:t>
+      </w:r>
+    </w:p>
+    <w:p>
+      <w:pPr>
+        <w:pStyle w:val="Geenafstand"/>
+        <w:rPr>
+          <w:lang w:val="en-GB"/>
+        </w:rPr>
+      </w:pPr>
+      <w:r>
+        <w:rPr>
+          <w:lang w:val="en-GB"/>
+        </w:rPr>
+        <w:t>Confusion matrix by a objectness threshold of 0.0, this is the threshold by which the highest mAP was found.</w:t>
+      </w:r>
+      <w:r>
+        <w:rPr>
+          <w:lang w:val="en-GB"/>
+        </w:rPr>
+        <w:tab/>
       </w:r>
     </w:p>
     <w:tbl>
       <w:tblPr>
-        <w:tblStyle w:val="TableGrid"/>
+        <w:tblStyle w:val="Tabelraster"/>
         <w:tblW w:w="0" w:type="auto"/>
         <w:tblLook w:val="04A0" w:firstRow="1" w:lastRow="0" w:firstColumn="1" w:lastColumn="0" w:noHBand="0" w:noVBand="1"/>
       </w:tblPr>
@@ -2784,7 +2861,7 @@
           </w:tcPr>
           <w:p>
             <w:pPr>
-              <w:pStyle w:val="NoSpacing"/>
+              <w:pStyle w:val="Geenafstand"/>
               <w:rPr>
                 <w:b/>
                 <w:lang w:val="en-GB"/>
@@ -2798,7 +2875,7 @@
           </w:tcPr>
           <w:p>
             <w:pPr>
-              <w:pStyle w:val="NoSpacing"/>
+              <w:pStyle w:val="Geenafstand"/>
               <w:rPr>
                 <w:b/>
                 <w:lang w:val="en-GB"/>
@@ -2814,7 +2891,7 @@
           </w:tcPr>
           <w:p>
             <w:pPr>
-              <w:pStyle w:val="NoSpacing"/>
+              <w:pStyle w:val="Geenafstand"/>
               <w:jc w:val="center"/>
               <w:rPr>
                 <w:b/>
@@ -2838,7 +2915,7 @@
           </w:tcPr>
           <w:p>
             <w:pPr>
-              <w:pStyle w:val="NoSpacing"/>
+              <w:pStyle w:val="Geenafstand"/>
               <w:rPr>
                 <w:lang w:val="en-GB"/>
               </w:rPr>
@@ -2851,7 +2928,7 @@
           </w:tcPr>
           <w:p>
             <w:pPr>
-              <w:pStyle w:val="NoSpacing"/>
+              <w:pStyle w:val="Geenafstand"/>
               <w:rPr>
                 <w:lang w:val="en-GB"/>
               </w:rPr>
@@ -2864,7 +2941,7 @@
           </w:tcPr>
           <w:p>
             <w:pPr>
-              <w:pStyle w:val="NoSpacing"/>
+              <w:pStyle w:val="Geenafstand"/>
               <w:rPr>
                 <w:b/>
                 <w:bCs/>
@@ -2887,7 +2964,7 @@
           </w:tcPr>
           <w:p>
             <w:pPr>
-              <w:pStyle w:val="NoSpacing"/>
+              <w:pStyle w:val="Geenafstand"/>
               <w:rPr>
                 <w:b/>
                 <w:bCs/>
@@ -2910,7 +2987,7 @@
           </w:tcPr>
           <w:p>
             <w:pPr>
-              <w:pStyle w:val="NoSpacing"/>
+              <w:pStyle w:val="Geenafstand"/>
               <w:rPr>
                 <w:b/>
                 <w:bCs/>
@@ -2937,7 +3014,7 @@
           </w:tcPr>
           <w:p>
             <w:pPr>
-              <w:pStyle w:val="NoSpacing"/>
+              <w:pStyle w:val="Geenafstand"/>
               <w:jc w:val="center"/>
               <w:rPr>
                 <w:b/>
@@ -2961,7 +3038,7 @@
           </w:tcPr>
           <w:p>
             <w:pPr>
-              <w:pStyle w:val="NoSpacing"/>
+              <w:pStyle w:val="Geenafstand"/>
               <w:rPr>
                 <w:b/>
                 <w:bCs/>
@@ -2984,17 +3061,16 @@
           </w:tcPr>
           <w:p>
             <w:pPr>
-              <w:pStyle w:val="NoSpacing"/>
+              <w:pStyle w:val="Geenafstand"/>
               <w:rPr>
                 <w:lang w:val="en-GB"/>
               </w:rPr>
             </w:pPr>
             <w:r>
               <w:rPr>
-                <w:highlight w:val="yellow"/>
-                <w:lang w:val="en-GB"/>
-              </w:rPr>
-              <w:t>…</w:t>
+                <w:lang w:val="en-GB"/>
+              </w:rPr>
+              <w:t>54</w:t>
             </w:r>
           </w:p>
         </w:tc>
@@ -3004,17 +3080,16 @@
           </w:tcPr>
           <w:p>
             <w:pPr>
-              <w:pStyle w:val="NoSpacing"/>
+              <w:pStyle w:val="Geenafstand"/>
               <w:rPr>
                 <w:lang w:val="en-GB"/>
               </w:rPr>
             </w:pPr>
             <w:r>
               <w:rPr>
-                <w:highlight w:val="yellow"/>
-                <w:lang w:val="en-GB"/>
-              </w:rPr>
-              <w:t>…</w:t>
+                <w:lang w:val="en-GB"/>
+              </w:rPr>
+              <w:t>130</w:t>
             </w:r>
           </w:p>
         </w:tc>
@@ -3024,17 +3099,16 @@
           </w:tcPr>
           <w:p>
             <w:pPr>
-              <w:pStyle w:val="NoSpacing"/>
+              <w:pStyle w:val="Geenafstand"/>
               <w:rPr>
                 <w:lang w:val="en-GB"/>
               </w:rPr>
             </w:pPr>
             <w:r>
               <w:rPr>
-                <w:highlight w:val="yellow"/>
-                <w:lang w:val="en-GB"/>
-              </w:rPr>
-              <w:t>…</w:t>
+                <w:lang w:val="en-GB"/>
+              </w:rPr>
+              <w:t>10684</w:t>
             </w:r>
           </w:p>
         </w:tc>
@@ -3047,7 +3121,7 @@
           </w:tcPr>
           <w:p>
             <w:pPr>
-              <w:pStyle w:val="NoSpacing"/>
+              <w:pStyle w:val="Geenafstand"/>
               <w:rPr>
                 <w:lang w:val="en-GB"/>
               </w:rPr>
@@ -3060,7 +3134,7 @@
           </w:tcPr>
           <w:p>
             <w:pPr>
-              <w:pStyle w:val="NoSpacing"/>
+              <w:pStyle w:val="Geenafstand"/>
               <w:rPr>
                 <w:b/>
                 <w:bCs/>
@@ -3083,17 +3157,16 @@
           </w:tcPr>
           <w:p>
             <w:pPr>
-              <w:pStyle w:val="NoSpacing"/>
+              <w:pStyle w:val="Geenafstand"/>
               <w:rPr>
                 <w:lang w:val="en-GB"/>
               </w:rPr>
             </w:pPr>
             <w:r>
               <w:rPr>
-                <w:highlight w:val="yellow"/>
-                <w:lang w:val="en-GB"/>
-              </w:rPr>
-              <w:t>…</w:t>
+                <w:lang w:val="en-GB"/>
+              </w:rPr>
+              <w:t>35</w:t>
             </w:r>
           </w:p>
         </w:tc>
@@ -3103,17 +3176,16 @@
           </w:tcPr>
           <w:p>
             <w:pPr>
-              <w:pStyle w:val="NoSpacing"/>
+              <w:pStyle w:val="Geenafstand"/>
               <w:rPr>
                 <w:lang w:val="en-GB"/>
               </w:rPr>
             </w:pPr>
             <w:r>
               <w:rPr>
-                <w:highlight w:val="yellow"/>
-                <w:lang w:val="en-GB"/>
-              </w:rPr>
-              <w:t>…</w:t>
+                <w:lang w:val="en-GB"/>
+              </w:rPr>
+              <w:t>80</w:t>
             </w:r>
           </w:p>
         </w:tc>
@@ -3123,17 +3195,16 @@
           </w:tcPr>
           <w:p>
             <w:pPr>
-              <w:pStyle w:val="NoSpacing"/>
+              <w:pStyle w:val="Geenafstand"/>
               <w:rPr>
                 <w:lang w:val="en-GB"/>
               </w:rPr>
             </w:pPr>
             <w:r>
               <w:rPr>
-                <w:highlight w:val="yellow"/>
-                <w:lang w:val="en-GB"/>
-              </w:rPr>
-              <w:t>…</w:t>
+                <w:lang w:val="en-GB"/>
+              </w:rPr>
+              <w:t>7125</w:t>
             </w:r>
           </w:p>
         </w:tc>
@@ -3149,7 +3220,7 @@
           </w:tcPr>
           <w:p>
             <w:pPr>
-              <w:pStyle w:val="NoSpacing"/>
+              <w:pStyle w:val="Geenafstand"/>
               <w:rPr>
                 <w:lang w:val="en-GB"/>
               </w:rPr>
@@ -3165,7 +3236,7 @@
           </w:tcPr>
           <w:p>
             <w:pPr>
-              <w:pStyle w:val="NoSpacing"/>
+              <w:pStyle w:val="Geenafstand"/>
               <w:rPr>
                 <w:b/>
                 <w:bCs/>
@@ -3191,17 +3262,16 @@
           </w:tcPr>
           <w:p>
             <w:pPr>
-              <w:pStyle w:val="NoSpacing"/>
+              <w:pStyle w:val="Geenafstand"/>
               <w:rPr>
                 <w:lang w:val="en-GB"/>
               </w:rPr>
             </w:pPr>
             <w:r>
               <w:rPr>
-                <w:highlight w:val="yellow"/>
-                <w:lang w:val="en-GB"/>
-              </w:rPr>
-              <w:t>…</w:t>
+                <w:lang w:val="en-GB"/>
+              </w:rPr>
+              <w:t>30</w:t>
             </w:r>
           </w:p>
         </w:tc>
@@ -3214,17 +3284,16 @@
           </w:tcPr>
           <w:p>
             <w:pPr>
-              <w:pStyle w:val="NoSpacing"/>
+              <w:pStyle w:val="Geenafstand"/>
               <w:rPr>
                 <w:lang w:val="en-GB"/>
               </w:rPr>
             </w:pPr>
             <w:r>
               <w:rPr>
-                <w:highlight w:val="yellow"/>
-                <w:lang w:val="en-GB"/>
-              </w:rPr>
-              <w:t>…</w:t>
+                <w:lang w:val="en-GB"/>
+              </w:rPr>
+              <w:t>40</w:t>
             </w:r>
           </w:p>
         </w:tc>
@@ -3238,7 +3307,7 @@
           </w:tcPr>
           <w:p>
             <w:pPr>
-              <w:pStyle w:val="NoSpacing"/>
+              <w:pStyle w:val="Geenafstand"/>
               <w:jc w:val="center"/>
               <w:rPr>
                 <w:lang w:val="en-GB"/>
@@ -3256,15 +3325,15 @@
     </w:tbl>
     <w:p>
       <w:pPr>
-        <w:pStyle w:val="NoSpacing"/>
-        <w:rPr>
-          <w:lang w:val="en-GB"/>
-        </w:rPr>
-      </w:pPr>
-    </w:p>
-    <w:p>
-      <w:pPr>
-        <w:pStyle w:val="NoSpacing"/>
+        <w:pStyle w:val="Geenafstand"/>
+        <w:rPr>
+          <w:lang w:val="en-GB"/>
+        </w:rPr>
+      </w:pPr>
+    </w:p>
+    <w:p>
+      <w:pPr>
+        <w:pStyle w:val="Geenafstand"/>
         <w:rPr>
           <w:b/>
           <w:sz w:val="24"/>
@@ -3282,7 +3351,7 @@
     </w:p>
     <w:p>
       <w:pPr>
-        <w:pStyle w:val="NoSpacing"/>
+        <w:pStyle w:val="Geenafstand"/>
         <w:rPr>
           <w:lang w:val="en-GB"/>
         </w:rPr>
@@ -3299,7 +3368,7 @@
         </w:rPr>
         <w:t xml:space="preserve"> </w:t>
       </w:r>
-      <w:commentRangeStart w:id="3"/>
+      <w:commentRangeStart w:id="2"/>
       <w:r>
         <w:fldChar w:fldCharType="begin"/>
       </w:r>
@@ -3330,28 +3399,28 @@
         </w:rPr>
         <w:t>.</w:t>
       </w:r>
-      <w:commentRangeEnd w:id="3"/>
-      <w:r>
-        <w:rPr>
-          <w:rStyle w:val="CommentReference"/>
+      <w:commentRangeEnd w:id="2"/>
+      <w:r>
+        <w:rPr>
+          <w:rStyle w:val="Verwijzingopmerking"/>
           <w:sz w:val="22"/>
           <w:szCs w:val="22"/>
           <w:lang w:val="en-GB"/>
         </w:rPr>
-        <w:commentReference w:id="3"/>
-      </w:r>
-    </w:p>
-    <w:p>
-      <w:pPr>
-        <w:pStyle w:val="NoSpacing"/>
-        <w:rPr>
-          <w:lang w:val="en-GB"/>
-        </w:rPr>
-      </w:pPr>
-    </w:p>
-    <w:p>
-      <w:pPr>
-        <w:pStyle w:val="NoSpacing"/>
+        <w:commentReference w:id="2"/>
+      </w:r>
+    </w:p>
+    <w:p>
+      <w:pPr>
+        <w:pStyle w:val="Geenafstand"/>
+        <w:rPr>
+          <w:lang w:val="en-GB"/>
+        </w:rPr>
+      </w:pPr>
+    </w:p>
+    <w:p>
+      <w:pPr>
+        <w:pStyle w:val="Geenafstand"/>
         <w:rPr>
           <w:b/>
           <w:sz w:val="24"/>
@@ -3369,7 +3438,7 @@
     </w:p>
     <w:p>
       <w:pPr>
-        <w:pStyle w:val="NoSpacing"/>
+        <w:pStyle w:val="Geenafstand"/>
         <w:rPr>
           <w:lang w:val="en-GB"/>
         </w:rPr>
@@ -3407,7 +3476,7 @@
     </w:p>
     <w:p>
       <w:pPr>
-        <w:pStyle w:val="NoSpacing"/>
+        <w:pStyle w:val="Geenafstand"/>
         <w:rPr>
           <w:lang w:val="en-GB"/>
         </w:rPr>
@@ -3452,7 +3521,7 @@
     </w:p>
     <w:p>
       <w:pPr>
-        <w:pStyle w:val="NoSpacing"/>
+        <w:pStyle w:val="Geenafstand"/>
         <w:rPr>
           <w:lang w:val="en-GB"/>
         </w:rPr>
@@ -3495,15 +3564,15 @@
     </w:p>
     <w:p>
       <w:pPr>
-        <w:pStyle w:val="NoSpacing"/>
-        <w:rPr>
-          <w:lang w:val="en-GB"/>
-        </w:rPr>
-      </w:pPr>
-    </w:p>
-    <w:p>
-      <w:pPr>
-        <w:pStyle w:val="NoSpacing"/>
+        <w:pStyle w:val="Geenafstand"/>
+        <w:rPr>
+          <w:lang w:val="en-GB"/>
+        </w:rPr>
+      </w:pPr>
+    </w:p>
+    <w:p>
+      <w:pPr>
+        <w:pStyle w:val="Geenafstand"/>
         <w:rPr>
           <w:b/>
           <w:sz w:val="24"/>
@@ -3521,7 +3590,7 @@
     </w:p>
     <w:p>
       <w:pPr>
-        <w:pStyle w:val="NoSpacing"/>
+        <w:pStyle w:val="Geenafstand"/>
         <w:rPr>
           <w:lang w:val="en-GB"/>
         </w:rPr>
@@ -3550,15 +3619,15 @@
     </w:p>
     <w:p>
       <w:pPr>
-        <w:pStyle w:val="NoSpacing"/>
-        <w:rPr>
-          <w:lang w:val="en-GB"/>
-        </w:rPr>
-      </w:pPr>
-    </w:p>
-    <w:p>
-      <w:pPr>
-        <w:pStyle w:val="NoSpacing"/>
+        <w:pStyle w:val="Geenafstand"/>
+        <w:rPr>
+          <w:lang w:val="en-GB"/>
+        </w:rPr>
+      </w:pPr>
+    </w:p>
+    <w:p>
+      <w:pPr>
+        <w:pStyle w:val="Geenafstand"/>
         <w:rPr>
           <w:b/>
           <w:bCs/>
@@ -3576,7 +3645,7 @@
     </w:p>
     <w:p>
       <w:pPr>
-        <w:pStyle w:val="NoSpacing"/>
+        <w:pStyle w:val="Geenafstand"/>
         <w:rPr>
           <w:lang w:val="en-GB"/>
         </w:rPr>
@@ -3591,7 +3660,7 @@
     </w:p>
     <w:p>
       <w:pPr>
-        <w:pStyle w:val="NoSpacing"/>
+        <w:pStyle w:val="Geenafstand"/>
         <w:rPr>
           <w:lang w:val="en-US"/>
         </w:rPr>
@@ -3627,7 +3696,7 @@
     </w:p>
     <w:p>
       <w:pPr>
-        <w:pStyle w:val="NoSpacing"/>
+        <w:pStyle w:val="Geenafstand"/>
         <w:rPr>
           <w:lang w:val="en-US"/>
         </w:rPr>
@@ -3669,7 +3738,7 @@
     </w:p>
     <w:p>
       <w:pPr>
-        <w:pStyle w:val="NoSpacing"/>
+        <w:pStyle w:val="Geenafstand"/>
         <w:rPr>
           <w:lang w:val="en-US"/>
         </w:rPr>
@@ -3707,46 +3776,30 @@
 
 <file path=word/comments.xml><?xml version="1.0" encoding="utf-8"?>
 <w:comments xmlns:wpc="http://schemas.microsoft.com/office/word/2010/wordprocessingCanvas" xmlns:cx="http://schemas.microsoft.com/office/drawing/2014/chartex" xmlns:cx1="http://schemas.microsoft.com/office/drawing/2015/9/8/chartex" xmlns:cx2="http://schemas.microsoft.com/office/drawing/2015/10/21/chartex" xmlns:cx3="http://schemas.microsoft.com/office/drawing/2016/5/9/chartex" xmlns:cx4="http://schemas.microsoft.com/office/drawing/2016/5/10/chartex" xmlns:cx5="http://schemas.microsoft.com/office/drawing/2016/5/11/chartex" xmlns:cx6="http://schemas.microsoft.com/office/drawing/2016/5/12/chartex" xmlns:cx7="http://schemas.microsoft.com/office/drawing/2016/5/13/chartex" xmlns:cx8="http://schemas.microsoft.com/office/drawing/2016/5/14/chartex" xmlns:mc="http://schemas.openxmlformats.org/markup-compatibility/2006" xmlns:aink="http://schemas.microsoft.com/office/drawing/2016/ink" xmlns:am3d="http://schemas.microsoft.com/office/drawing/2017/model3d" xmlns:o="urn:schemas-microsoft-com:office:office" xmlns:oel="http://schemas.microsoft.com/office/2019/extlst" xmlns:r="http://schemas.openxmlformats.org/officeDocument/2006/relationships" xmlns:m="http://schemas.openxmlformats.org/officeDocument/2006/math" xmlns:v="urn:schemas-microsoft-com:vml" xmlns:wp14="http://schemas.microsoft.com/office/word/2010/wordprocessingDrawing" xmlns:wp="http://schemas.openxmlformats.org/drawingml/2006/wordprocessingDrawing" xmlns:w10="urn:schemas-microsoft-com:office:word" xmlns:w="http://schemas.openxmlformats.org/wordprocessingml/2006/main" xmlns:w14="http://schemas.microsoft.com/office/word/2010/wordml" xmlns:w15="http://schemas.microsoft.com/office/word/2012/wordml" xmlns:w16cex="http://schemas.microsoft.com/office/word/2018/wordml/cex" xmlns:w16cid="http://schemas.microsoft.com/office/word/2016/wordml/cid" xmlns:w16="http://schemas.microsoft.com/office/word/2018/wordml" xmlns:w16du="http://schemas.microsoft.com/office/word/2023/wordml/word16du" xmlns:w16sdtdh="http://schemas.microsoft.com/office/word/2020/wordml/sdtdatahash" xmlns:w16sdtfl="http://schemas.microsoft.com/office/word/2024/wordml/sdtformatlock" xmlns:w16se="http://schemas.microsoft.com/office/word/2015/wordml/symex" xmlns:wpg="http://schemas.microsoft.com/office/word/2010/wordprocessingGroup" xmlns:wpi="http://schemas.microsoft.com/office/word/2010/wordprocessingInk" xmlns:wne="http://schemas.microsoft.com/office/word/2006/wordml" xmlns:wps="http://schemas.microsoft.com/office/word/2010/wordprocessingShape" mc:Ignorable="w14 w15 w16se w16cid w16 w16cex w16sdtdh w16sdtfl w16du wp14">
-  <w:comment w:id="0" w:author="Heemskerk, J.P.H. (Joris)" w:date="2026-03-24T10:19:00Z" w:initials="JH">
-    <w:p>
-      <w:pPr>
-        <w:pStyle w:val="CommentText"/>
-      </w:pPr>
-      <w:r>
-        <w:rPr>
-          <w:rStyle w:val="CommentReference"/>
+  <w:comment w:id="1" w:author="Heemskerk, J.P.H. (Joris)" w:date="2026-03-25T15:22:00Z" w:initials="JH">
+    <w:p>
+      <w:pPr>
+        <w:pStyle w:val="Tekstopmerking"/>
+      </w:pPr>
+      <w:r>
+        <w:rPr>
+          <w:rStyle w:val="Verwijzingopmerking"/>
         </w:rPr>
         <w:annotationRef/>
       </w:r>
       <w:r>
-        <w:t>Update in final version</w:t>
+        <w:t>Zet ergens ook even welke objectness threshold we gebruiken</w:t>
       </w:r>
     </w:p>
   </w:comment>
   <w:comment w:id="2" w:author="Heemskerk, J.P.H. (Joris)" w:date="2026-03-25T15:22:00Z" w:initials="JH">
     <w:p>
       <w:pPr>
-        <w:pStyle w:val="CommentText"/>
-      </w:pPr>
-      <w:r>
-        <w:rPr>
-          <w:rStyle w:val="CommentReference"/>
-        </w:rPr>
-        <w:annotationRef/>
-      </w:r>
-      <w:r>
-        <w:t>Zet ergens ook even welke objectness threshold we gebruiken</w:t>
-      </w:r>
-    </w:p>
-  </w:comment>
-  <w:comment w:id="3" w:author="Heemskerk, J.P.H. (Joris)" w:date="2026-03-25T15:22:00Z" w:initials="JH">
-    <w:p>
-      <w:pPr>
-        <w:pStyle w:val="CommentText"/>
-      </w:pPr>
-      <w:r>
-        <w:rPr>
-          <w:rStyle w:val="CommentReference"/>
+        <w:pStyle w:val="Tekstopmerking"/>
+      </w:pPr>
+      <w:r>
+        <w:rPr>
+          <w:rStyle w:val="Verwijzingopmerking"/>
         </w:rPr>
         <w:annotationRef/>
       </w:r>
@@ -3760,7 +3813,6 @@
 
 <file path=word/commentsExtended.xml><?xml version="1.0" encoding="utf-8"?>
 <w15:commentsEx xmlns:wpc="http://schemas.microsoft.com/office/word/2010/wordprocessingCanvas" xmlns:cx="http://schemas.microsoft.com/office/drawing/2014/chartex" xmlns:cx1="http://schemas.microsoft.com/office/drawing/2015/9/8/chartex" xmlns:cx2="http://schemas.microsoft.com/office/drawing/2015/10/21/chartex" xmlns:cx3="http://schemas.microsoft.com/office/drawing/2016/5/9/chartex" xmlns:cx4="http://schemas.microsoft.com/office/drawing/2016/5/10/chartex" xmlns:cx5="http://schemas.microsoft.com/office/drawing/2016/5/11/chartex" xmlns:cx6="http://schemas.microsoft.com/office/drawing/2016/5/12/chartex" xmlns:cx7="http://schemas.microsoft.com/office/drawing/2016/5/13/chartex" xmlns:cx8="http://schemas.microsoft.com/office/drawing/2016/5/14/chartex" xmlns:mc="http://schemas.openxmlformats.org/markup-compatibility/2006" xmlns:aink="http://schemas.microsoft.com/office/drawing/2016/ink" xmlns:am3d="http://schemas.microsoft.com/office/drawing/2017/model3d" xmlns:o="urn:schemas-microsoft-com:office:office" xmlns:oel="http://schemas.microsoft.com/office/2019/extlst" xmlns:r="http://schemas.openxmlformats.org/officeDocument/2006/relationships" xmlns:m="http://schemas.openxmlformats.org/officeDocument/2006/math" xmlns:v="urn:schemas-microsoft-com:vml" xmlns:wp14="http://schemas.microsoft.com/office/word/2010/wordprocessingDrawing" xmlns:wp="http://schemas.openxmlformats.org/drawingml/2006/wordprocessingDrawing" xmlns:w10="urn:schemas-microsoft-com:office:word" xmlns:w="http://schemas.openxmlformats.org/wordprocessingml/2006/main" xmlns:w14="http://schemas.microsoft.com/office/word/2010/wordml" xmlns:w15="http://schemas.microsoft.com/office/word/2012/wordml" xmlns:w16cex="http://schemas.microsoft.com/office/word/2018/wordml/cex" xmlns:w16cid="http://schemas.microsoft.com/office/word/2016/wordml/cid" xmlns:w16="http://schemas.microsoft.com/office/word/2018/wordml" xmlns:w16du="http://schemas.microsoft.com/office/word/2023/wordml/word16du" xmlns:w16sdtdh="http://schemas.microsoft.com/office/word/2020/wordml/sdtdatahash" xmlns:w16sdtfl="http://schemas.microsoft.com/office/word/2024/wordml/sdtformatlock" xmlns:w16se="http://schemas.microsoft.com/office/word/2015/wordml/symex" xmlns:wpg="http://schemas.microsoft.com/office/word/2010/wordprocessingGroup" xmlns:wpi="http://schemas.microsoft.com/office/word/2010/wordprocessingInk" xmlns:wne="http://schemas.microsoft.com/office/word/2006/wordml" xmlns:wps="http://schemas.microsoft.com/office/word/2010/wordprocessingShape" mc:Ignorable="w14 w15 w16se w16cid w16 w16cex w16sdtdh w16sdtfl w16du wp14">
-  <w15:commentEx w15:paraId="2ABB0458" w15:done="0"/>
   <w15:commentEx w15:paraId="57EE860C" w15:done="0"/>
   <w15:commentEx w15:paraId="22F68D96" w15:done="0"/>
 </w15:commentsEx>
@@ -3768,7 +3820,6 @@
 
 <file path=word/commentsExtensible.xml><?xml version="1.0" encoding="utf-8"?>
 <w16cex:commentsExtensible xmlns:wpc="http://schemas.microsoft.com/office/word/2010/wordprocessingCanvas" xmlns:cx="http://schemas.microsoft.com/office/drawing/2014/chartex" xmlns:cx1="http://schemas.microsoft.com/office/drawing/2015/9/8/chartex" xmlns:cx2="http://schemas.microsoft.com/office/drawing/2015/10/21/chartex" xmlns:cx3="http://schemas.microsoft.com/office/drawing/2016/5/9/chartex" xmlns:cx4="http://schemas.microsoft.com/office/drawing/2016/5/10/chartex" xmlns:cx5="http://schemas.microsoft.com/office/drawing/2016/5/11/chartex" xmlns:cx6="http://schemas.microsoft.com/office/drawing/2016/5/12/chartex" xmlns:cx7="http://schemas.microsoft.com/office/drawing/2016/5/13/chartex" xmlns:cx8="http://schemas.microsoft.com/office/drawing/2016/5/14/chartex" xmlns:cr="http://schemas.microsoft.com/office/comments/2020/reactions" xmlns:mc="http://schemas.openxmlformats.org/markup-compatibility/2006" xmlns:aink="http://schemas.microsoft.com/office/drawing/2016/ink" xmlns:am3d="http://schemas.microsoft.com/office/drawing/2017/model3d" xmlns:o="urn:schemas-microsoft-com:office:office" xmlns:oel="http://schemas.microsoft.com/office/2019/extlst" xmlns:r="http://schemas.openxmlformats.org/officeDocument/2006/relationships" xmlns:m="http://schemas.openxmlformats.org/officeDocument/2006/math" xmlns:v="urn:schemas-microsoft-com:vml" xmlns:wp14="http://schemas.microsoft.com/office/word/2010/wordprocessingDrawing" xmlns:wp="http://schemas.openxmlformats.org/drawingml/2006/wordprocessingDrawing" xmlns:w10="urn:schemas-microsoft-com:office:word" xmlns:w="http://schemas.openxmlformats.org/wordprocessingml/2006/main" xmlns:w14="http://schemas.microsoft.com/office/word/2010/wordml" xmlns:w15="http://schemas.microsoft.com/office/word/2012/wordml" xmlns:w16cex="http://schemas.microsoft.com/office/word/2018/wordml/cex" xmlns:w16cid="http://schemas.microsoft.com/office/word/2016/wordml/cid" xmlns:w16="http://schemas.microsoft.com/office/word/2018/wordml" xmlns:w16du="http://schemas.microsoft.com/office/word/2023/wordml/word16du" xmlns:w16sdtdh="http://schemas.microsoft.com/office/word/2020/wordml/sdtdatahash" xmlns:w16sdtfl="http://schemas.microsoft.com/office/word/2024/wordml/sdtformatlock" xmlns:w16se="http://schemas.microsoft.com/office/word/2015/wordml/symex" xmlns:wpg="http://schemas.microsoft.com/office/word/2010/wordprocessingGroup" xmlns:wpi="http://schemas.microsoft.com/office/word/2010/wordprocessingInk" xmlns:wne="http://schemas.microsoft.com/office/word/2006/wordml" xmlns:wps="http://schemas.microsoft.com/office/word/2010/wordprocessingShape" mc:Ignorable="w14 w15 w16se w16cid w16 w16cex w16sdtdh w16sdtfl cr w16du wp14">
-  <w16cex:commentExtensible w16cex:durableId="2EB91F58" w16cex:dateUtc="2026-03-24T09:19:00Z"/>
   <w16cex:commentExtensible w16cex:durableId="0780D052" w16cex:dateUtc="2026-03-25T14:22:00Z"/>
   <w16cex:commentExtensible w16cex:durableId="307FC1D6" w16cex:dateUtc="2026-03-25T14:22:00Z"/>
 </w16cex:commentsExtensible>
@@ -3776,7 +3827,6 @@
 
 <file path=word/commentsIds.xml><?xml version="1.0" encoding="utf-8"?>
 <w16cid:commentsIds xmlns:wpc="http://schemas.microsoft.com/office/word/2010/wordprocessingCanvas" xmlns:cx="http://schemas.microsoft.com/office/drawing/2014/chartex" xmlns:cx1="http://schemas.microsoft.com/office/drawing/2015/9/8/chartex" xmlns:cx2="http://schemas.microsoft.com/office/drawing/2015/10/21/chartex" xmlns:cx3="http://schemas.microsoft.com/office/drawing/2016/5/9/chartex" xmlns:cx4="http://schemas.microsoft.com/office/drawing/2016/5/10/chartex" xmlns:cx5="http://schemas.microsoft.com/office/drawing/2016/5/11/chartex" xmlns:cx6="http://schemas.microsoft.com/office/drawing/2016/5/12/chartex" xmlns:cx7="http://schemas.microsoft.com/office/drawing/2016/5/13/chartex" xmlns:cx8="http://schemas.microsoft.com/office/drawing/2016/5/14/chartex" xmlns:mc="http://schemas.openxmlformats.org/markup-compatibility/2006" xmlns:aink="http://schemas.microsoft.com/office/drawing/2016/ink" xmlns:am3d="http://schemas.microsoft.com/office/drawing/2017/model3d" xmlns:o="urn:schemas-microsoft-com:office:office" xmlns:oel="http://schemas.microsoft.com/office/2019/extlst" xmlns:r="http://schemas.openxmlformats.org/officeDocument/2006/relationships" xmlns:m="http://schemas.openxmlformats.org/officeDocument/2006/math" xmlns:v="urn:schemas-microsoft-com:vml" xmlns:wp14="http://schemas.microsoft.com/office/word/2010/wordprocessingDrawing" xmlns:wp="http://schemas.openxmlformats.org/drawingml/2006/wordprocessingDrawing" xmlns:w10="urn:schemas-microsoft-com:office:word" xmlns:w="http://schemas.openxmlformats.org/wordprocessingml/2006/main" xmlns:w14="http://schemas.microsoft.com/office/word/2010/wordml" xmlns:w15="http://schemas.microsoft.com/office/word/2012/wordml" xmlns:w16cex="http://schemas.microsoft.com/office/word/2018/wordml/cex" xmlns:w16cid="http://schemas.microsoft.com/office/word/2016/wordml/cid" xmlns:w16="http://schemas.microsoft.com/office/word/2018/wordml" xmlns:w16du="http://schemas.microsoft.com/office/word/2023/wordml/word16du" xmlns:w16sdtdh="http://schemas.microsoft.com/office/word/2020/wordml/sdtdatahash" xmlns:w16sdtfl="http://schemas.microsoft.com/office/word/2024/wordml/sdtformatlock" xmlns:w16se="http://schemas.microsoft.com/office/word/2015/wordml/symex" xmlns:wpg="http://schemas.microsoft.com/office/word/2010/wordprocessingGroup" xmlns:wpi="http://schemas.microsoft.com/office/word/2010/wordprocessingInk" xmlns:wne="http://schemas.microsoft.com/office/word/2006/wordml" xmlns:wps="http://schemas.microsoft.com/office/word/2010/wordprocessingShape" mc:Ignorable="w14 w15 w16se w16cid w16 w16cex w16sdtdh w16sdtfl w16du wp14">
-  <w16cid:commentId w16cid:paraId="2ABB0458" w16cid:durableId="2EB91F58"/>
   <w16cid:commentId w16cid:paraId="57EE860C" w16cid:durableId="0780D052"/>
   <w16cid:commentId w16cid:paraId="22F68D96" w16cid:durableId="307FC1D6"/>
 </w16cid:commentsIds>
@@ -4185,17 +4235,17 @@
     <w:lsdException w:name="Unresolved Mention" w:semiHidden="1" w:unhideWhenUsed="1"/>
     <w:lsdException w:name="Smart Link" w:semiHidden="1" w:unhideWhenUsed="1"/>
   </w:latentStyles>
-  <w:style w:type="paragraph" w:default="1" w:styleId="Normal">
+  <w:style w:type="paragraph" w:default="1" w:styleId="Standaard">
     <w:name w:val="Normal"/>
     <w:qFormat/>
   </w:style>
-  <w:style w:type="character" w:default="1" w:styleId="DefaultParagraphFont">
+  <w:style w:type="character" w:default="1" w:styleId="Standaardalinea-lettertype">
     <w:name w:val="Default Paragraph Font"/>
     <w:uiPriority w:val="1"/>
     <w:semiHidden/>
     <w:unhideWhenUsed/>
   </w:style>
-  <w:style w:type="table" w:default="1" w:styleId="TableNormal">
+  <w:style w:type="table" w:default="1" w:styleId="Standaardtabel">
     <w:name w:val="Normal Table"/>
     <w:uiPriority w:val="99"/>
     <w:semiHidden/>
@@ -4210,13 +4260,13 @@
       </w:tblCellMar>
     </w:tblPr>
   </w:style>
-  <w:style w:type="numbering" w:default="1" w:styleId="NoList">
+  <w:style w:type="numbering" w:default="1" w:styleId="Geenlijst">
     <w:name w:val="No List"/>
     <w:uiPriority w:val="99"/>
     <w:semiHidden/>
     <w:unhideWhenUsed/>
   </w:style>
-  <w:style w:type="paragraph" w:styleId="NoSpacing">
+  <w:style w:type="paragraph" w:styleId="Geenafstand">
     <w:name w:val="No Spacing"/>
     <w:uiPriority w:val="1"/>
     <w:qFormat/>
@@ -4225,9 +4275,9 @@
       <w:spacing w:after="0" w:line="240" w:lineRule="auto"/>
     </w:pPr>
   </w:style>
-  <w:style w:type="table" w:styleId="TableGrid">
+  <w:style w:type="table" w:styleId="Tabelraster">
     <w:name w:val="Table Grid"/>
-    <w:basedOn w:val="TableNormal"/>
+    <w:basedOn w:val="Standaardtabel"/>
     <w:uiPriority w:val="39"/>
     <w:rsid w:val="00E06445"/>
     <w:pPr>
@@ -4244,9 +4294,9 @@
       </w:tblBorders>
     </w:tblPr>
   </w:style>
-  <w:style w:type="character" w:styleId="SubtleEmphasis">
+  <w:style w:type="character" w:styleId="Subtielebenadrukking">
     <w:name w:val="Subtle Emphasis"/>
-    <w:basedOn w:val="DefaultParagraphFont"/>
+    <w:basedOn w:val="Standaardalinea-lettertype"/>
     <w:uiPriority w:val="19"/>
     <w:qFormat/>
     <w:rsid w:val="00C87BC2"/>
@@ -4256,9 +4306,9 @@
       <w:color w:val="404040" w:themeColor="text1" w:themeTint="BF"/>
     </w:rPr>
   </w:style>
-  <w:style w:type="character" w:styleId="PlaceholderText">
+  <w:style w:type="character" w:styleId="Tekstvantijdelijkeaanduiding">
     <w:name w:val="Placeholder Text"/>
-    <w:basedOn w:val="DefaultParagraphFont"/>
+    <w:basedOn w:val="Standaardalinea-lettertype"/>
     <w:uiPriority w:val="99"/>
     <w:semiHidden/>
     <w:rsid w:val="00DA6236"/>
@@ -4268,7 +4318,7 @@
   </w:style>
   <w:style w:type="character" w:styleId="Hyperlink">
     <w:name w:val="Hyperlink"/>
-    <w:basedOn w:val="DefaultParagraphFont"/>
+    <w:basedOn w:val="Standaardalinea-lettertype"/>
     <w:uiPriority w:val="99"/>
     <w:unhideWhenUsed/>
     <w:rsid w:val="00DD7669"/>
@@ -4277,9 +4327,9 @@
       <w:u w:val="single"/>
     </w:rPr>
   </w:style>
-  <w:style w:type="character" w:styleId="UnresolvedMention">
+  <w:style w:type="character" w:styleId="Onopgelostemelding">
     <w:name w:val="Unresolved Mention"/>
-    <w:basedOn w:val="DefaultParagraphFont"/>
+    <w:basedOn w:val="Standaardalinea-lettertype"/>
     <w:uiPriority w:val="99"/>
     <w:semiHidden/>
     <w:unhideWhenUsed/>
@@ -4289,9 +4339,9 @@
       <w:shd w:val="clear" w:color="auto" w:fill="E1DFDD"/>
     </w:rPr>
   </w:style>
-  <w:style w:type="character" w:styleId="FollowedHyperlink">
+  <w:style w:type="character" w:styleId="GevolgdeHyperlink">
     <w:name w:val="FollowedHyperlink"/>
-    <w:basedOn w:val="DefaultParagraphFont"/>
+    <w:basedOn w:val="Standaardalinea-lettertype"/>
     <w:uiPriority w:val="99"/>
     <w:semiHidden/>
     <w:unhideWhenUsed/>
@@ -4301,9 +4351,9 @@
       <w:u w:val="single"/>
     </w:rPr>
   </w:style>
-  <w:style w:type="character" w:styleId="CommentReference">
+  <w:style w:type="character" w:styleId="Verwijzingopmerking">
     <w:name w:val="annotation reference"/>
-    <w:basedOn w:val="DefaultParagraphFont"/>
+    <w:basedOn w:val="Standaardalinea-lettertype"/>
     <w:uiPriority w:val="99"/>
     <w:semiHidden/>
     <w:unhideWhenUsed/>
@@ -4313,10 +4363,10 @@
       <w:szCs w:val="16"/>
     </w:rPr>
   </w:style>
-  <w:style w:type="paragraph" w:styleId="CommentText">
+  <w:style w:type="paragraph" w:styleId="Tekstopmerking">
     <w:name w:val="annotation text"/>
-    <w:basedOn w:val="Normal"/>
-    <w:link w:val="CommentTextChar"/>
+    <w:basedOn w:val="Standaard"/>
+    <w:link w:val="TekstopmerkingChar"/>
     <w:uiPriority w:val="99"/>
     <w:unhideWhenUsed/>
     <w:rsid w:val="00160822"/>
@@ -4328,10 +4378,10 @@
       <w:szCs w:val="20"/>
     </w:rPr>
   </w:style>
-  <w:style w:type="character" w:customStyle="1" w:styleId="CommentTextChar">
-    <w:name w:val="Comment Text Char"/>
-    <w:basedOn w:val="DefaultParagraphFont"/>
-    <w:link w:val="CommentText"/>
+  <w:style w:type="character" w:customStyle="1" w:styleId="TekstopmerkingChar">
+    <w:name w:val="Tekst opmerking Char"/>
+    <w:basedOn w:val="Standaardalinea-lettertype"/>
+    <w:link w:val="Tekstopmerking"/>
     <w:uiPriority w:val="99"/>
     <w:rsid w:val="00160822"/>
     <w:rPr>
@@ -4339,11 +4389,11 @@
       <w:szCs w:val="20"/>
     </w:rPr>
   </w:style>
-  <w:style w:type="paragraph" w:styleId="CommentSubject">
+  <w:style w:type="paragraph" w:styleId="Onderwerpvanopmerking">
     <w:name w:val="annotation subject"/>
-    <w:basedOn w:val="CommentText"/>
-    <w:next w:val="CommentText"/>
-    <w:link w:val="CommentSubjectChar"/>
+    <w:basedOn w:val="Tekstopmerking"/>
+    <w:next w:val="Tekstopmerking"/>
+    <w:link w:val="OnderwerpvanopmerkingChar"/>
     <w:uiPriority w:val="99"/>
     <w:semiHidden/>
     <w:unhideWhenUsed/>
@@ -4353,10 +4403,10 @@
       <w:bCs/>
     </w:rPr>
   </w:style>
-  <w:style w:type="character" w:customStyle="1" w:styleId="CommentSubjectChar">
-    <w:name w:val="Comment Subject Char"/>
-    <w:basedOn w:val="CommentTextChar"/>
-    <w:link w:val="CommentSubject"/>
+  <w:style w:type="character" w:customStyle="1" w:styleId="OnderwerpvanopmerkingChar">
+    <w:name w:val="Onderwerp van opmerking Char"/>
+    <w:basedOn w:val="TekstopmerkingChar"/>
+    <w:link w:val="Onderwerpvanopmerking"/>
     <w:uiPriority w:val="99"/>
     <w:semiHidden/>
     <w:rsid w:val="00160822"/>
@@ -4367,10 +4417,10 @@
       <w:szCs w:val="20"/>
     </w:rPr>
   </w:style>
-  <w:style w:type="paragraph" w:styleId="Caption">
+  <w:style w:type="paragraph" w:styleId="Bijschrift">
     <w:name w:val="caption"/>
-    <w:basedOn w:val="Normal"/>
-    <w:next w:val="Normal"/>
+    <w:basedOn w:val="Standaard"/>
+    <w:next w:val="Standaard"/>
     <w:uiPriority w:val="35"/>
     <w:unhideWhenUsed/>
     <w:qFormat/>

</xml_diff>